<commit_message>
RDA:lab4 in progress. Data description in progress
</commit_message>
<xml_diff>
--- a/RDA/Labs/lab4/Спецификация требований по Вигерсу.docx
+++ b/RDA/Labs/lab4/Спецификация требований по Вигерсу.docx
@@ -11,6 +11,7 @@
       <w:sdtPr>
         <w:rPr>
           <w:rFonts w:asciiTheme="minorHAnsi" w:eastAsiaTheme="minorHAnsi" w:hAnsiTheme="minorHAnsi" w:cstheme="minorBidi"/>
+          <w:b w:val="0"/>
           <w:color w:val="auto"/>
           <w:sz w:val="22"/>
           <w:szCs w:val="22"/>
@@ -59,7 +60,7 @@
           <w:r>
             <w:fldChar w:fldCharType="separate"/>
           </w:r>
-          <w:hyperlink w:anchor="_Toc197445799" w:history="1">
+          <w:hyperlink w:anchor="_Toc197449547" w:history="1">
             <w:r>
               <w:rPr>
                 <w:rStyle w:val="a5"/>
@@ -101,7 +102,7 @@
                 <w:noProof/>
                 <w:webHidden/>
               </w:rPr>
-              <w:instrText xml:space="preserve"> PAGEREF _Toc197445799 \h </w:instrText>
+              <w:instrText xml:space="preserve"> PAGEREF _Toc197449547 \h </w:instrText>
             </w:r>
             <w:r>
               <w:rPr>
@@ -121,7 +122,7 @@
                 <w:noProof/>
                 <w:webHidden/>
               </w:rPr>
-              <w:t>2</w:t>
+              <w:t>3</w:t>
             </w:r>
             <w:r>
               <w:rPr>
@@ -145,7 +146,7 @@
               <w:lang w:eastAsia="ru-RU"/>
             </w:rPr>
           </w:pPr>
-          <w:hyperlink w:anchor="_Toc197445800" w:history="1">
+          <w:hyperlink w:anchor="_Toc197449548" w:history="1">
             <w:r>
               <w:rPr>
                 <w:rStyle w:val="a5"/>
@@ -187,7 +188,7 @@
                 <w:noProof/>
                 <w:webHidden/>
               </w:rPr>
-              <w:instrText xml:space="preserve"> PAGEREF _Toc197445800 \h </w:instrText>
+              <w:instrText xml:space="preserve"> PAGEREF _Toc197449548 \h </w:instrText>
             </w:r>
             <w:r>
               <w:rPr>
@@ -207,7 +208,7 @@
                 <w:noProof/>
                 <w:webHidden/>
               </w:rPr>
-              <w:t>2</w:t>
+              <w:t>3</w:t>
             </w:r>
             <w:r>
               <w:rPr>
@@ -231,7 +232,7 @@
               <w:lang w:eastAsia="ru-RU"/>
             </w:rPr>
           </w:pPr>
-          <w:hyperlink w:anchor="_Toc197445801" w:history="1">
+          <w:hyperlink w:anchor="_Toc197449549" w:history="1">
             <w:r>
               <w:rPr>
                 <w:rStyle w:val="a5"/>
@@ -273,7 +274,7 @@
                 <w:noProof/>
                 <w:webHidden/>
               </w:rPr>
-              <w:instrText xml:space="preserve"> PAGEREF _Toc197445801 \h </w:instrText>
+              <w:instrText xml:space="preserve"> PAGEREF _Toc197449549 \h </w:instrText>
             </w:r>
             <w:r>
               <w:rPr>
@@ -293,7 +294,7 @@
                 <w:noProof/>
                 <w:webHidden/>
               </w:rPr>
-              <w:t>2</w:t>
+              <w:t>3</w:t>
             </w:r>
             <w:r>
               <w:rPr>
@@ -317,7 +318,7 @@
               <w:lang w:eastAsia="ru-RU"/>
             </w:rPr>
           </w:pPr>
-          <w:hyperlink w:anchor="_Toc197445802" w:history="1">
+          <w:hyperlink w:anchor="_Toc197449550" w:history="1">
             <w:r>
               <w:rPr>
                 <w:rStyle w:val="a5"/>
@@ -359,7 +360,7 @@
                 <w:noProof/>
                 <w:webHidden/>
               </w:rPr>
-              <w:instrText xml:space="preserve"> PAGEREF _Toc197445802 \h </w:instrText>
+              <w:instrText xml:space="preserve"> PAGEREF _Toc197449550 \h </w:instrText>
             </w:r>
             <w:r>
               <w:rPr>
@@ -403,7 +404,7 @@
               <w:lang w:eastAsia="ru-RU"/>
             </w:rPr>
           </w:pPr>
-          <w:hyperlink w:anchor="_Toc197445803" w:history="1">
+          <w:hyperlink w:anchor="_Toc197449551" w:history="1">
             <w:r>
               <w:rPr>
                 <w:rStyle w:val="a5"/>
@@ -445,7 +446,7 @@
                 <w:noProof/>
                 <w:webHidden/>
               </w:rPr>
-              <w:instrText xml:space="preserve"> PAGEREF _Toc197445803 \h </w:instrText>
+              <w:instrText xml:space="preserve"> PAGEREF _Toc197449551 \h </w:instrText>
             </w:r>
             <w:r>
               <w:rPr>
@@ -489,7 +490,7 @@
               <w:lang w:eastAsia="ru-RU"/>
             </w:rPr>
           </w:pPr>
-          <w:hyperlink w:anchor="_Toc197445804" w:history="1">
+          <w:hyperlink w:anchor="_Toc197449552" w:history="1">
             <w:r>
               <w:rPr>
                 <w:rStyle w:val="a5"/>
@@ -531,7 +532,7 @@
                 <w:noProof/>
                 <w:webHidden/>
               </w:rPr>
-              <w:instrText xml:space="preserve"> PAGEREF _Toc197445804 \h </w:instrText>
+              <w:instrText xml:space="preserve"> PAGEREF _Toc197449552 \h </w:instrText>
             </w:r>
             <w:r>
               <w:rPr>
@@ -551,7 +552,7 @@
                 <w:noProof/>
                 <w:webHidden/>
               </w:rPr>
-              <w:t>3</w:t>
+              <w:t>4</w:t>
             </w:r>
             <w:r>
               <w:rPr>
@@ -575,7 +576,7 @@
               <w:lang w:eastAsia="ru-RU"/>
             </w:rPr>
           </w:pPr>
-          <w:hyperlink w:anchor="_Toc197445805" w:history="1">
+          <w:hyperlink w:anchor="_Toc197449553" w:history="1">
             <w:r>
               <w:rPr>
                 <w:rStyle w:val="a5"/>
@@ -617,7 +618,7 @@
                 <w:noProof/>
                 <w:webHidden/>
               </w:rPr>
-              <w:instrText xml:space="preserve"> PAGEREF _Toc197445805 \h </w:instrText>
+              <w:instrText xml:space="preserve"> PAGEREF _Toc197449553 \h </w:instrText>
             </w:r>
             <w:r>
               <w:rPr>
@@ -637,7 +638,7 @@
                 <w:noProof/>
                 <w:webHidden/>
               </w:rPr>
-              <w:t>3</w:t>
+              <w:t>4</w:t>
             </w:r>
             <w:r>
               <w:rPr>
@@ -661,7 +662,7 @@
               <w:lang w:eastAsia="ru-RU"/>
             </w:rPr>
           </w:pPr>
-          <w:hyperlink w:anchor="_Toc197445806" w:history="1">
+          <w:hyperlink w:anchor="_Toc197449554" w:history="1">
             <w:r>
               <w:rPr>
                 <w:rStyle w:val="a5"/>
@@ -705,7 +706,7 @@
                 <w:noProof/>
                 <w:webHidden/>
               </w:rPr>
-              <w:instrText xml:space="preserve"> PAGEREF _Toc197445806 \h </w:instrText>
+              <w:instrText xml:space="preserve"> PAGEREF _Toc197449554 \h </w:instrText>
             </w:r>
             <w:r>
               <w:rPr>
@@ -725,7 +726,7 @@
                 <w:noProof/>
                 <w:webHidden/>
               </w:rPr>
-              <w:t>3</w:t>
+              <w:t>4</w:t>
             </w:r>
             <w:r>
               <w:rPr>
@@ -749,7 +750,7 @@
               <w:lang w:eastAsia="ru-RU"/>
             </w:rPr>
           </w:pPr>
-          <w:hyperlink w:anchor="_Toc197445807" w:history="1">
+          <w:hyperlink w:anchor="_Toc197449555" w:history="1">
             <w:r>
               <w:rPr>
                 <w:rStyle w:val="a5"/>
@@ -791,7 +792,7 @@
                 <w:noProof/>
                 <w:webHidden/>
               </w:rPr>
-              <w:instrText xml:space="preserve"> PAGEREF _Toc197445807 \h </w:instrText>
+              <w:instrText xml:space="preserve"> PAGEREF _Toc197449555 \h </w:instrText>
             </w:r>
             <w:r>
               <w:rPr>
@@ -835,7 +836,7 @@
               <w:lang w:eastAsia="ru-RU"/>
             </w:rPr>
           </w:pPr>
-          <w:hyperlink w:anchor="_Toc197445808" w:history="1">
+          <w:hyperlink w:anchor="_Toc197449556" w:history="1">
             <w:r>
               <w:rPr>
                 <w:rStyle w:val="a5"/>
@@ -877,7 +878,7 @@
                 <w:noProof/>
                 <w:webHidden/>
               </w:rPr>
-              <w:instrText xml:space="preserve"> PAGEREF _Toc197445808 \h </w:instrText>
+              <w:instrText xml:space="preserve"> PAGEREF _Toc197449556 \h </w:instrText>
             </w:r>
             <w:r>
               <w:rPr>
@@ -897,7 +898,7 @@
                 <w:noProof/>
                 <w:webHidden/>
               </w:rPr>
-              <w:t>4</w:t>
+              <w:t>5</w:t>
             </w:r>
             <w:r>
               <w:rPr>
@@ -921,7 +922,7 @@
               <w:lang w:eastAsia="ru-RU"/>
             </w:rPr>
           </w:pPr>
-          <w:hyperlink w:anchor="_Toc197445809" w:history="1">
+          <w:hyperlink w:anchor="_Toc197449557" w:history="1">
             <w:r>
               <w:rPr>
                 <w:rStyle w:val="a5"/>
@@ -963,7 +964,7 @@
                 <w:noProof/>
                 <w:webHidden/>
               </w:rPr>
-              <w:instrText xml:space="preserve"> PAGEREF _Toc197445809 \h </w:instrText>
+              <w:instrText xml:space="preserve"> PAGEREF _Toc197449557 \h </w:instrText>
             </w:r>
             <w:r>
               <w:rPr>
@@ -983,7 +984,7 @@
                 <w:noProof/>
                 <w:webHidden/>
               </w:rPr>
-              <w:t>4</w:t>
+              <w:t>5</w:t>
             </w:r>
             <w:r>
               <w:rPr>
@@ -1007,7 +1008,7 @@
               <w:lang w:eastAsia="ru-RU"/>
             </w:rPr>
           </w:pPr>
-          <w:hyperlink w:anchor="_Toc197445810" w:history="1">
+          <w:hyperlink w:anchor="_Toc197449558" w:history="1">
             <w:r>
               <w:rPr>
                 <w:rStyle w:val="a5"/>
@@ -1049,7 +1050,7 @@
                 <w:noProof/>
                 <w:webHidden/>
               </w:rPr>
-              <w:instrText xml:space="preserve"> PAGEREF _Toc197445810 \h </w:instrText>
+              <w:instrText xml:space="preserve"> PAGEREF _Toc197449558 \h </w:instrText>
             </w:r>
             <w:r>
               <w:rPr>
@@ -1093,7 +1094,7 @@
               <w:lang w:eastAsia="ru-RU"/>
             </w:rPr>
           </w:pPr>
-          <w:hyperlink w:anchor="_Toc197445811" w:history="1">
+          <w:hyperlink w:anchor="_Toc197449559" w:history="1">
             <w:r>
               <w:rPr>
                 <w:rStyle w:val="a5"/>
@@ -1135,7 +1136,7 @@
                 <w:noProof/>
                 <w:webHidden/>
               </w:rPr>
-              <w:instrText xml:space="preserve"> PAGEREF _Toc197445811 \h </w:instrText>
+              <w:instrText xml:space="preserve"> PAGEREF _Toc197449559 \h </w:instrText>
             </w:r>
             <w:r>
               <w:rPr>
@@ -1179,7 +1180,7 @@
               <w:lang w:eastAsia="ru-RU"/>
             </w:rPr>
           </w:pPr>
-          <w:hyperlink w:anchor="_Toc197445812" w:history="1">
+          <w:hyperlink w:anchor="_Toc197449560" w:history="1">
             <w:r>
               <w:rPr>
                 <w:rStyle w:val="a5"/>
@@ -1221,7 +1222,7 @@
                 <w:noProof/>
                 <w:webHidden/>
               </w:rPr>
-              <w:instrText xml:space="preserve"> PAGEREF _Toc197445812 \h </w:instrText>
+              <w:instrText xml:space="preserve"> PAGEREF _Toc197449560 \h </w:instrText>
             </w:r>
             <w:r>
               <w:rPr>
@@ -1265,7 +1266,7 @@
               <w:lang w:eastAsia="ru-RU"/>
             </w:rPr>
           </w:pPr>
-          <w:hyperlink w:anchor="_Toc197445813" w:history="1">
+          <w:hyperlink w:anchor="_Toc197449561" w:history="1">
             <w:r>
               <w:rPr>
                 <w:rStyle w:val="a5"/>
@@ -1307,7 +1308,7 @@
                 <w:noProof/>
                 <w:webHidden/>
               </w:rPr>
-              <w:instrText xml:space="preserve"> PAGEREF _Toc197445813 \h </w:instrText>
+              <w:instrText xml:space="preserve"> PAGEREF _Toc197449561 \h </w:instrText>
             </w:r>
             <w:r>
               <w:rPr>
@@ -1351,7 +1352,7 @@
               <w:lang w:eastAsia="ru-RU"/>
             </w:rPr>
           </w:pPr>
-          <w:hyperlink w:anchor="_Toc197445814" w:history="1">
+          <w:hyperlink w:anchor="_Toc197449562" w:history="1">
             <w:r>
               <w:rPr>
                 <w:rStyle w:val="a5"/>
@@ -1393,7 +1394,7 @@
                 <w:noProof/>
                 <w:webHidden/>
               </w:rPr>
-              <w:instrText xml:space="preserve"> PAGEREF _Toc197445814 \h </w:instrText>
+              <w:instrText xml:space="preserve"> PAGEREF _Toc197449562 \h </w:instrText>
             </w:r>
             <w:r>
               <w:rPr>
@@ -1437,7 +1438,7 @@
               <w:lang w:eastAsia="ru-RU"/>
             </w:rPr>
           </w:pPr>
-          <w:hyperlink w:anchor="_Toc197445815" w:history="1">
+          <w:hyperlink w:anchor="_Toc197449563" w:history="1">
             <w:r>
               <w:rPr>
                 <w:rStyle w:val="a5"/>
@@ -1479,7 +1480,7 @@
                 <w:noProof/>
                 <w:webHidden/>
               </w:rPr>
-              <w:instrText xml:space="preserve"> PAGEREF _Toc197445815 \h </w:instrText>
+              <w:instrText xml:space="preserve"> PAGEREF _Toc197449563 \h </w:instrText>
             </w:r>
             <w:r>
               <w:rPr>
@@ -1523,7 +1524,7 @@
               <w:lang w:eastAsia="ru-RU"/>
             </w:rPr>
           </w:pPr>
-          <w:hyperlink w:anchor="_Toc197445816" w:history="1">
+          <w:hyperlink w:anchor="_Toc197449564" w:history="1">
             <w:r>
               <w:rPr>
                 <w:rStyle w:val="a5"/>
@@ -1565,7 +1566,7 @@
                 <w:noProof/>
                 <w:webHidden/>
               </w:rPr>
-              <w:instrText xml:space="preserve"> PAGEREF _Toc197445816 \h </w:instrText>
+              <w:instrText xml:space="preserve"> PAGEREF _Toc197449564 \h </w:instrText>
             </w:r>
             <w:r>
               <w:rPr>
@@ -1609,7 +1610,7 @@
               <w:lang w:eastAsia="ru-RU"/>
             </w:rPr>
           </w:pPr>
-          <w:hyperlink w:anchor="_Toc197445817" w:history="1">
+          <w:hyperlink w:anchor="_Toc197449565" w:history="1">
             <w:r>
               <w:rPr>
                 <w:rStyle w:val="a5"/>
@@ -1651,7 +1652,7 @@
                 <w:noProof/>
                 <w:webHidden/>
               </w:rPr>
-              <w:instrText xml:space="preserve"> PAGEREF _Toc197445817 \h </w:instrText>
+              <w:instrText xml:space="preserve"> PAGEREF _Toc197449565 \h </w:instrText>
             </w:r>
             <w:r>
               <w:rPr>
@@ -1695,7 +1696,7 @@
               <w:lang w:eastAsia="ru-RU"/>
             </w:rPr>
           </w:pPr>
-          <w:hyperlink w:anchor="_Toc197445818" w:history="1">
+          <w:hyperlink w:anchor="_Toc197449566" w:history="1">
             <w:r>
               <w:rPr>
                 <w:rStyle w:val="a5"/>
@@ -1737,7 +1738,7 @@
                 <w:noProof/>
                 <w:webHidden/>
               </w:rPr>
-              <w:instrText xml:space="preserve"> PAGEREF _Toc197445818 \h </w:instrText>
+              <w:instrText xml:space="preserve"> PAGEREF _Toc197449566 \h </w:instrText>
             </w:r>
             <w:r>
               <w:rPr>
@@ -1781,7 +1782,7 @@
               <w:lang w:eastAsia="ru-RU"/>
             </w:rPr>
           </w:pPr>
-          <w:hyperlink w:anchor="_Toc197445819" w:history="1">
+          <w:hyperlink w:anchor="_Toc197449567" w:history="1">
             <w:r>
               <w:rPr>
                 <w:rStyle w:val="a5"/>
@@ -1823,7 +1824,7 @@
                 <w:noProof/>
                 <w:webHidden/>
               </w:rPr>
-              <w:instrText xml:space="preserve"> PAGEREF _Toc197445819 \h </w:instrText>
+              <w:instrText xml:space="preserve"> PAGEREF _Toc197449567 \h </w:instrText>
             </w:r>
             <w:r>
               <w:rPr>
@@ -1867,7 +1868,7 @@
               <w:lang w:eastAsia="ru-RU"/>
             </w:rPr>
           </w:pPr>
-          <w:hyperlink w:anchor="_Toc197445820" w:history="1">
+          <w:hyperlink w:anchor="_Toc197449568" w:history="1">
             <w:r>
               <w:rPr>
                 <w:rStyle w:val="a5"/>
@@ -1909,7 +1910,7 @@
                 <w:noProof/>
                 <w:webHidden/>
               </w:rPr>
-              <w:instrText xml:space="preserve"> PAGEREF _Toc197445820 \h </w:instrText>
+              <w:instrText xml:space="preserve"> PAGEREF _Toc197449568 \h </w:instrText>
             </w:r>
             <w:r>
               <w:rPr>
@@ -1953,7 +1954,7 @@
               <w:lang w:eastAsia="ru-RU"/>
             </w:rPr>
           </w:pPr>
-          <w:hyperlink w:anchor="_Toc197445821" w:history="1">
+          <w:hyperlink w:anchor="_Toc197449569" w:history="1">
             <w:r>
               <w:rPr>
                 <w:rStyle w:val="a5"/>
@@ -1995,7 +1996,7 @@
                 <w:noProof/>
                 <w:webHidden/>
               </w:rPr>
-              <w:instrText xml:space="preserve"> PAGEREF _Toc197445821 \h </w:instrText>
+              <w:instrText xml:space="preserve"> PAGEREF _Toc197449569 \h </w:instrText>
             </w:r>
             <w:r>
               <w:rPr>
@@ -2039,7 +2040,7 @@
               <w:lang w:eastAsia="ru-RU"/>
             </w:rPr>
           </w:pPr>
-          <w:hyperlink w:anchor="_Toc197445822" w:history="1">
+          <w:hyperlink w:anchor="_Toc197449570" w:history="1">
             <w:r>
               <w:rPr>
                 <w:rStyle w:val="a5"/>
@@ -2081,7 +2082,7 @@
                 <w:noProof/>
                 <w:webHidden/>
               </w:rPr>
-              <w:instrText xml:space="preserve"> PAGEREF _Toc197445822 \h </w:instrText>
+              <w:instrText xml:space="preserve"> PAGEREF _Toc197449570 \h </w:instrText>
             </w:r>
             <w:r>
               <w:rPr>
@@ -2102,6 +2103,1038 @@
                 <w:webHidden/>
               </w:rPr>
               <w:t>8</w:t>
+            </w:r>
+            <w:r>
+              <w:rPr>
+                <w:noProof/>
+                <w:webHidden/>
+              </w:rPr>
+              <w:fldChar w:fldCharType="end"/>
+            </w:r>
+          </w:hyperlink>
+        </w:p>
+        <w:p>
+          <w:pPr>
+            <w:pStyle w:val="23"/>
+            <w:tabs>
+              <w:tab w:val="left" w:pos="880"/>
+              <w:tab w:val="right" w:leader="dot" w:pos="9016"/>
+            </w:tabs>
+            <w:rPr>
+              <w:rFonts w:eastAsiaTheme="minorEastAsia"/>
+              <w:noProof/>
+              <w:lang w:eastAsia="ru-RU"/>
+            </w:rPr>
+          </w:pPr>
+          <w:hyperlink w:anchor="_Toc197449571" w:history="1">
+            <w:r>
+              <w:rPr>
+                <w:rStyle w:val="a5"/>
+                <w:noProof/>
+              </w:rPr>
+              <w:t>3.5</w:t>
+            </w:r>
+            <w:r>
+              <w:rPr>
+                <w:rFonts w:eastAsiaTheme="minorEastAsia"/>
+                <w:noProof/>
+                <w:lang w:eastAsia="ru-RU"/>
+              </w:rPr>
+              <w:tab/>
+            </w:r>
+            <w:r>
+              <w:rPr>
+                <w:rStyle w:val="a5"/>
+                <w:noProof/>
+              </w:rPr>
+              <w:t>Добавление проекта</w:t>
+            </w:r>
+            <w:r>
+              <w:rPr>
+                <w:noProof/>
+                <w:webHidden/>
+              </w:rPr>
+              <w:tab/>
+            </w:r>
+            <w:r>
+              <w:rPr>
+                <w:noProof/>
+                <w:webHidden/>
+              </w:rPr>
+              <w:fldChar w:fldCharType="begin"/>
+            </w:r>
+            <w:r>
+              <w:rPr>
+                <w:noProof/>
+                <w:webHidden/>
+              </w:rPr>
+              <w:instrText xml:space="preserve"> PAGEREF _Toc197449571 \h </w:instrText>
+            </w:r>
+            <w:r>
+              <w:rPr>
+                <w:noProof/>
+                <w:webHidden/>
+              </w:rPr>
+            </w:r>
+            <w:r>
+              <w:rPr>
+                <w:noProof/>
+                <w:webHidden/>
+              </w:rPr>
+              <w:fldChar w:fldCharType="separate"/>
+            </w:r>
+            <w:r>
+              <w:rPr>
+                <w:noProof/>
+                <w:webHidden/>
+              </w:rPr>
+              <w:t>8</w:t>
+            </w:r>
+            <w:r>
+              <w:rPr>
+                <w:noProof/>
+                <w:webHidden/>
+              </w:rPr>
+              <w:fldChar w:fldCharType="end"/>
+            </w:r>
+          </w:hyperlink>
+        </w:p>
+        <w:p>
+          <w:pPr>
+            <w:pStyle w:val="33"/>
+            <w:tabs>
+              <w:tab w:val="left" w:pos="1320"/>
+              <w:tab w:val="right" w:leader="dot" w:pos="9016"/>
+            </w:tabs>
+            <w:rPr>
+              <w:rFonts w:eastAsiaTheme="minorEastAsia"/>
+              <w:noProof/>
+              <w:lang w:eastAsia="ru-RU"/>
+            </w:rPr>
+          </w:pPr>
+          <w:hyperlink w:anchor="_Toc197449572" w:history="1">
+            <w:r>
+              <w:rPr>
+                <w:rStyle w:val="a5"/>
+                <w:noProof/>
+              </w:rPr>
+              <w:t>3.5.1</w:t>
+            </w:r>
+            <w:r>
+              <w:rPr>
+                <w:rFonts w:eastAsiaTheme="minorEastAsia"/>
+                <w:noProof/>
+                <w:lang w:eastAsia="ru-RU"/>
+              </w:rPr>
+              <w:tab/>
+            </w:r>
+            <w:r>
+              <w:rPr>
+                <w:rStyle w:val="a5"/>
+                <w:noProof/>
+              </w:rPr>
+              <w:t>Описание</w:t>
+            </w:r>
+            <w:r>
+              <w:rPr>
+                <w:noProof/>
+                <w:webHidden/>
+              </w:rPr>
+              <w:tab/>
+            </w:r>
+            <w:r>
+              <w:rPr>
+                <w:noProof/>
+                <w:webHidden/>
+              </w:rPr>
+              <w:fldChar w:fldCharType="begin"/>
+            </w:r>
+            <w:r>
+              <w:rPr>
+                <w:noProof/>
+                <w:webHidden/>
+              </w:rPr>
+              <w:instrText xml:space="preserve"> PAGEREF _Toc197449572 \h </w:instrText>
+            </w:r>
+            <w:r>
+              <w:rPr>
+                <w:noProof/>
+                <w:webHidden/>
+              </w:rPr>
+            </w:r>
+            <w:r>
+              <w:rPr>
+                <w:noProof/>
+                <w:webHidden/>
+              </w:rPr>
+              <w:fldChar w:fldCharType="separate"/>
+            </w:r>
+            <w:r>
+              <w:rPr>
+                <w:noProof/>
+                <w:webHidden/>
+              </w:rPr>
+              <w:t>8</w:t>
+            </w:r>
+            <w:r>
+              <w:rPr>
+                <w:noProof/>
+                <w:webHidden/>
+              </w:rPr>
+              <w:fldChar w:fldCharType="end"/>
+            </w:r>
+          </w:hyperlink>
+        </w:p>
+        <w:p>
+          <w:pPr>
+            <w:pStyle w:val="33"/>
+            <w:tabs>
+              <w:tab w:val="left" w:pos="1320"/>
+              <w:tab w:val="right" w:leader="dot" w:pos="9016"/>
+            </w:tabs>
+            <w:rPr>
+              <w:rFonts w:eastAsiaTheme="minorEastAsia"/>
+              <w:noProof/>
+              <w:lang w:eastAsia="ru-RU"/>
+            </w:rPr>
+          </w:pPr>
+          <w:hyperlink w:anchor="_Toc197449573" w:history="1">
+            <w:r>
+              <w:rPr>
+                <w:rStyle w:val="a5"/>
+                <w:noProof/>
+              </w:rPr>
+              <w:t>3.5.2</w:t>
+            </w:r>
+            <w:r>
+              <w:rPr>
+                <w:rFonts w:eastAsiaTheme="minorEastAsia"/>
+                <w:noProof/>
+                <w:lang w:eastAsia="ru-RU"/>
+              </w:rPr>
+              <w:tab/>
+            </w:r>
+            <w:r>
+              <w:rPr>
+                <w:rStyle w:val="a5"/>
+                <w:noProof/>
+              </w:rPr>
+              <w:t>Функциональные требования</w:t>
+            </w:r>
+            <w:r>
+              <w:rPr>
+                <w:noProof/>
+                <w:webHidden/>
+              </w:rPr>
+              <w:tab/>
+            </w:r>
+            <w:r>
+              <w:rPr>
+                <w:noProof/>
+                <w:webHidden/>
+              </w:rPr>
+              <w:fldChar w:fldCharType="begin"/>
+            </w:r>
+            <w:r>
+              <w:rPr>
+                <w:noProof/>
+                <w:webHidden/>
+              </w:rPr>
+              <w:instrText xml:space="preserve"> PAGEREF _Toc197449573 \h </w:instrText>
+            </w:r>
+            <w:r>
+              <w:rPr>
+                <w:noProof/>
+                <w:webHidden/>
+              </w:rPr>
+            </w:r>
+            <w:r>
+              <w:rPr>
+                <w:noProof/>
+                <w:webHidden/>
+              </w:rPr>
+              <w:fldChar w:fldCharType="separate"/>
+            </w:r>
+            <w:r>
+              <w:rPr>
+                <w:noProof/>
+                <w:webHidden/>
+              </w:rPr>
+              <w:t>8</w:t>
+            </w:r>
+            <w:r>
+              <w:rPr>
+                <w:noProof/>
+                <w:webHidden/>
+              </w:rPr>
+              <w:fldChar w:fldCharType="end"/>
+            </w:r>
+          </w:hyperlink>
+        </w:p>
+        <w:p>
+          <w:pPr>
+            <w:pStyle w:val="23"/>
+            <w:tabs>
+              <w:tab w:val="left" w:pos="880"/>
+              <w:tab w:val="right" w:leader="dot" w:pos="9016"/>
+            </w:tabs>
+            <w:rPr>
+              <w:rFonts w:eastAsiaTheme="minorEastAsia"/>
+              <w:noProof/>
+              <w:lang w:eastAsia="ru-RU"/>
+            </w:rPr>
+          </w:pPr>
+          <w:hyperlink w:anchor="_Toc197449574" w:history="1">
+            <w:r>
+              <w:rPr>
+                <w:rStyle w:val="a5"/>
+                <w:noProof/>
+              </w:rPr>
+              <w:t>3.6</w:t>
+            </w:r>
+            <w:r>
+              <w:rPr>
+                <w:rFonts w:eastAsiaTheme="minorEastAsia"/>
+                <w:noProof/>
+                <w:lang w:eastAsia="ru-RU"/>
+              </w:rPr>
+              <w:tab/>
+            </w:r>
+            <w:r>
+              <w:rPr>
+                <w:rStyle w:val="a5"/>
+                <w:noProof/>
+              </w:rPr>
+              <w:t>Удаление проекта</w:t>
+            </w:r>
+            <w:r>
+              <w:rPr>
+                <w:noProof/>
+                <w:webHidden/>
+              </w:rPr>
+              <w:tab/>
+            </w:r>
+            <w:r>
+              <w:rPr>
+                <w:noProof/>
+                <w:webHidden/>
+              </w:rPr>
+              <w:fldChar w:fldCharType="begin"/>
+            </w:r>
+            <w:r>
+              <w:rPr>
+                <w:noProof/>
+                <w:webHidden/>
+              </w:rPr>
+              <w:instrText xml:space="preserve"> PAGEREF _Toc197449574 \h </w:instrText>
+            </w:r>
+            <w:r>
+              <w:rPr>
+                <w:noProof/>
+                <w:webHidden/>
+              </w:rPr>
+            </w:r>
+            <w:r>
+              <w:rPr>
+                <w:noProof/>
+                <w:webHidden/>
+              </w:rPr>
+              <w:fldChar w:fldCharType="separate"/>
+            </w:r>
+            <w:r>
+              <w:rPr>
+                <w:noProof/>
+                <w:webHidden/>
+              </w:rPr>
+              <w:t>8</w:t>
+            </w:r>
+            <w:r>
+              <w:rPr>
+                <w:noProof/>
+                <w:webHidden/>
+              </w:rPr>
+              <w:fldChar w:fldCharType="end"/>
+            </w:r>
+          </w:hyperlink>
+        </w:p>
+        <w:p>
+          <w:pPr>
+            <w:pStyle w:val="33"/>
+            <w:tabs>
+              <w:tab w:val="left" w:pos="1320"/>
+              <w:tab w:val="right" w:leader="dot" w:pos="9016"/>
+            </w:tabs>
+            <w:rPr>
+              <w:rFonts w:eastAsiaTheme="minorEastAsia"/>
+              <w:noProof/>
+              <w:lang w:eastAsia="ru-RU"/>
+            </w:rPr>
+          </w:pPr>
+          <w:hyperlink w:anchor="_Toc197449575" w:history="1">
+            <w:r>
+              <w:rPr>
+                <w:rStyle w:val="a5"/>
+                <w:noProof/>
+              </w:rPr>
+              <w:t>3.6.1</w:t>
+            </w:r>
+            <w:r>
+              <w:rPr>
+                <w:rFonts w:eastAsiaTheme="minorEastAsia"/>
+                <w:noProof/>
+                <w:lang w:eastAsia="ru-RU"/>
+              </w:rPr>
+              <w:tab/>
+            </w:r>
+            <w:r>
+              <w:rPr>
+                <w:rStyle w:val="a5"/>
+                <w:noProof/>
+              </w:rPr>
+              <w:t>Описание</w:t>
+            </w:r>
+            <w:r>
+              <w:rPr>
+                <w:noProof/>
+                <w:webHidden/>
+              </w:rPr>
+              <w:tab/>
+            </w:r>
+            <w:r>
+              <w:rPr>
+                <w:noProof/>
+                <w:webHidden/>
+              </w:rPr>
+              <w:fldChar w:fldCharType="begin"/>
+            </w:r>
+            <w:r>
+              <w:rPr>
+                <w:noProof/>
+                <w:webHidden/>
+              </w:rPr>
+              <w:instrText xml:space="preserve"> PAGEREF _Toc197449575 \h </w:instrText>
+            </w:r>
+            <w:r>
+              <w:rPr>
+                <w:noProof/>
+                <w:webHidden/>
+              </w:rPr>
+            </w:r>
+            <w:r>
+              <w:rPr>
+                <w:noProof/>
+                <w:webHidden/>
+              </w:rPr>
+              <w:fldChar w:fldCharType="separate"/>
+            </w:r>
+            <w:r>
+              <w:rPr>
+                <w:noProof/>
+                <w:webHidden/>
+              </w:rPr>
+              <w:t>8</w:t>
+            </w:r>
+            <w:r>
+              <w:rPr>
+                <w:noProof/>
+                <w:webHidden/>
+              </w:rPr>
+              <w:fldChar w:fldCharType="end"/>
+            </w:r>
+          </w:hyperlink>
+        </w:p>
+        <w:p>
+          <w:pPr>
+            <w:pStyle w:val="33"/>
+            <w:tabs>
+              <w:tab w:val="left" w:pos="1320"/>
+              <w:tab w:val="right" w:leader="dot" w:pos="9016"/>
+            </w:tabs>
+            <w:rPr>
+              <w:rFonts w:eastAsiaTheme="minorEastAsia"/>
+              <w:noProof/>
+              <w:lang w:eastAsia="ru-RU"/>
+            </w:rPr>
+          </w:pPr>
+          <w:hyperlink w:anchor="_Toc197449576" w:history="1">
+            <w:r>
+              <w:rPr>
+                <w:rStyle w:val="a5"/>
+                <w:noProof/>
+              </w:rPr>
+              <w:t>3.6.2</w:t>
+            </w:r>
+            <w:r>
+              <w:rPr>
+                <w:rFonts w:eastAsiaTheme="minorEastAsia"/>
+                <w:noProof/>
+                <w:lang w:eastAsia="ru-RU"/>
+              </w:rPr>
+              <w:tab/>
+            </w:r>
+            <w:r>
+              <w:rPr>
+                <w:rStyle w:val="a5"/>
+                <w:noProof/>
+              </w:rPr>
+              <w:t>Функциональные требования</w:t>
+            </w:r>
+            <w:r>
+              <w:rPr>
+                <w:noProof/>
+                <w:webHidden/>
+              </w:rPr>
+              <w:tab/>
+            </w:r>
+            <w:r>
+              <w:rPr>
+                <w:noProof/>
+                <w:webHidden/>
+              </w:rPr>
+              <w:fldChar w:fldCharType="begin"/>
+            </w:r>
+            <w:r>
+              <w:rPr>
+                <w:noProof/>
+                <w:webHidden/>
+              </w:rPr>
+              <w:instrText xml:space="preserve"> PAGEREF _Toc197449576 \h </w:instrText>
+            </w:r>
+            <w:r>
+              <w:rPr>
+                <w:noProof/>
+                <w:webHidden/>
+              </w:rPr>
+            </w:r>
+            <w:r>
+              <w:rPr>
+                <w:noProof/>
+                <w:webHidden/>
+              </w:rPr>
+              <w:fldChar w:fldCharType="separate"/>
+            </w:r>
+            <w:r>
+              <w:rPr>
+                <w:noProof/>
+                <w:webHidden/>
+              </w:rPr>
+              <w:t>8</w:t>
+            </w:r>
+            <w:r>
+              <w:rPr>
+                <w:noProof/>
+                <w:webHidden/>
+              </w:rPr>
+              <w:fldChar w:fldCharType="end"/>
+            </w:r>
+          </w:hyperlink>
+        </w:p>
+        <w:p>
+          <w:pPr>
+            <w:pStyle w:val="23"/>
+            <w:tabs>
+              <w:tab w:val="left" w:pos="880"/>
+              <w:tab w:val="right" w:leader="dot" w:pos="9016"/>
+            </w:tabs>
+            <w:rPr>
+              <w:rFonts w:eastAsiaTheme="minorEastAsia"/>
+              <w:noProof/>
+              <w:lang w:eastAsia="ru-RU"/>
+            </w:rPr>
+          </w:pPr>
+          <w:hyperlink w:anchor="_Toc197449577" w:history="1">
+            <w:r>
+              <w:rPr>
+                <w:rStyle w:val="a5"/>
+                <w:noProof/>
+              </w:rPr>
+              <w:t>3.7</w:t>
+            </w:r>
+            <w:r>
+              <w:rPr>
+                <w:rFonts w:eastAsiaTheme="minorEastAsia"/>
+                <w:noProof/>
+                <w:lang w:eastAsia="ru-RU"/>
+              </w:rPr>
+              <w:tab/>
+            </w:r>
+            <w:r>
+              <w:rPr>
+                <w:rStyle w:val="a5"/>
+                <w:noProof/>
+              </w:rPr>
+              <w:t>Прикрепление/открепление разработчиков на проект/с проекта</w:t>
+            </w:r>
+            <w:r>
+              <w:rPr>
+                <w:noProof/>
+                <w:webHidden/>
+              </w:rPr>
+              <w:tab/>
+            </w:r>
+            <w:r>
+              <w:rPr>
+                <w:noProof/>
+                <w:webHidden/>
+              </w:rPr>
+              <w:fldChar w:fldCharType="begin"/>
+            </w:r>
+            <w:r>
+              <w:rPr>
+                <w:noProof/>
+                <w:webHidden/>
+              </w:rPr>
+              <w:instrText xml:space="preserve"> PAGEREF _Toc197449577 \h </w:instrText>
+            </w:r>
+            <w:r>
+              <w:rPr>
+                <w:noProof/>
+                <w:webHidden/>
+              </w:rPr>
+            </w:r>
+            <w:r>
+              <w:rPr>
+                <w:noProof/>
+                <w:webHidden/>
+              </w:rPr>
+              <w:fldChar w:fldCharType="separate"/>
+            </w:r>
+            <w:r>
+              <w:rPr>
+                <w:noProof/>
+                <w:webHidden/>
+              </w:rPr>
+              <w:t>9</w:t>
+            </w:r>
+            <w:r>
+              <w:rPr>
+                <w:noProof/>
+                <w:webHidden/>
+              </w:rPr>
+              <w:fldChar w:fldCharType="end"/>
+            </w:r>
+          </w:hyperlink>
+        </w:p>
+        <w:p>
+          <w:pPr>
+            <w:pStyle w:val="33"/>
+            <w:tabs>
+              <w:tab w:val="left" w:pos="1320"/>
+              <w:tab w:val="right" w:leader="dot" w:pos="9016"/>
+            </w:tabs>
+            <w:rPr>
+              <w:rFonts w:eastAsiaTheme="minorEastAsia"/>
+              <w:noProof/>
+              <w:lang w:eastAsia="ru-RU"/>
+            </w:rPr>
+          </w:pPr>
+          <w:hyperlink w:anchor="_Toc197449578" w:history="1">
+            <w:r>
+              <w:rPr>
+                <w:rStyle w:val="a5"/>
+                <w:noProof/>
+              </w:rPr>
+              <w:t>3.7.1</w:t>
+            </w:r>
+            <w:r>
+              <w:rPr>
+                <w:rFonts w:eastAsiaTheme="minorEastAsia"/>
+                <w:noProof/>
+                <w:lang w:eastAsia="ru-RU"/>
+              </w:rPr>
+              <w:tab/>
+            </w:r>
+            <w:r>
+              <w:rPr>
+                <w:rStyle w:val="a5"/>
+                <w:noProof/>
+              </w:rPr>
+              <w:t>Описание</w:t>
+            </w:r>
+            <w:r>
+              <w:rPr>
+                <w:noProof/>
+                <w:webHidden/>
+              </w:rPr>
+              <w:tab/>
+            </w:r>
+            <w:r>
+              <w:rPr>
+                <w:noProof/>
+                <w:webHidden/>
+              </w:rPr>
+              <w:fldChar w:fldCharType="begin"/>
+            </w:r>
+            <w:r>
+              <w:rPr>
+                <w:noProof/>
+                <w:webHidden/>
+              </w:rPr>
+              <w:instrText xml:space="preserve"> PAGEREF _Toc197449578 \h </w:instrText>
+            </w:r>
+            <w:r>
+              <w:rPr>
+                <w:noProof/>
+                <w:webHidden/>
+              </w:rPr>
+            </w:r>
+            <w:r>
+              <w:rPr>
+                <w:noProof/>
+                <w:webHidden/>
+              </w:rPr>
+              <w:fldChar w:fldCharType="separate"/>
+            </w:r>
+            <w:r>
+              <w:rPr>
+                <w:noProof/>
+                <w:webHidden/>
+              </w:rPr>
+              <w:t>9</w:t>
+            </w:r>
+            <w:r>
+              <w:rPr>
+                <w:noProof/>
+                <w:webHidden/>
+              </w:rPr>
+              <w:fldChar w:fldCharType="end"/>
+            </w:r>
+          </w:hyperlink>
+        </w:p>
+        <w:p>
+          <w:pPr>
+            <w:pStyle w:val="33"/>
+            <w:tabs>
+              <w:tab w:val="left" w:pos="1320"/>
+              <w:tab w:val="right" w:leader="dot" w:pos="9016"/>
+            </w:tabs>
+            <w:rPr>
+              <w:rFonts w:eastAsiaTheme="minorEastAsia"/>
+              <w:noProof/>
+              <w:lang w:eastAsia="ru-RU"/>
+            </w:rPr>
+          </w:pPr>
+          <w:hyperlink w:anchor="_Toc197449579" w:history="1">
+            <w:r>
+              <w:rPr>
+                <w:rStyle w:val="a5"/>
+                <w:noProof/>
+              </w:rPr>
+              <w:t>3.7.2</w:t>
+            </w:r>
+            <w:r>
+              <w:rPr>
+                <w:rFonts w:eastAsiaTheme="minorEastAsia"/>
+                <w:noProof/>
+                <w:lang w:eastAsia="ru-RU"/>
+              </w:rPr>
+              <w:tab/>
+            </w:r>
+            <w:r>
+              <w:rPr>
+                <w:rStyle w:val="a5"/>
+                <w:noProof/>
+              </w:rPr>
+              <w:t>Функциональные требования</w:t>
+            </w:r>
+            <w:r>
+              <w:rPr>
+                <w:noProof/>
+                <w:webHidden/>
+              </w:rPr>
+              <w:tab/>
+            </w:r>
+            <w:r>
+              <w:rPr>
+                <w:noProof/>
+                <w:webHidden/>
+              </w:rPr>
+              <w:fldChar w:fldCharType="begin"/>
+            </w:r>
+            <w:r>
+              <w:rPr>
+                <w:noProof/>
+                <w:webHidden/>
+              </w:rPr>
+              <w:instrText xml:space="preserve"> PAGEREF _Toc197449579 \h </w:instrText>
+            </w:r>
+            <w:r>
+              <w:rPr>
+                <w:noProof/>
+                <w:webHidden/>
+              </w:rPr>
+            </w:r>
+            <w:r>
+              <w:rPr>
+                <w:noProof/>
+                <w:webHidden/>
+              </w:rPr>
+              <w:fldChar w:fldCharType="separate"/>
+            </w:r>
+            <w:r>
+              <w:rPr>
+                <w:noProof/>
+                <w:webHidden/>
+              </w:rPr>
+              <w:t>9</w:t>
+            </w:r>
+            <w:r>
+              <w:rPr>
+                <w:noProof/>
+                <w:webHidden/>
+              </w:rPr>
+              <w:fldChar w:fldCharType="end"/>
+            </w:r>
+          </w:hyperlink>
+        </w:p>
+        <w:p>
+          <w:pPr>
+            <w:pStyle w:val="13"/>
+            <w:tabs>
+              <w:tab w:val="left" w:pos="440"/>
+              <w:tab w:val="right" w:leader="dot" w:pos="9016"/>
+            </w:tabs>
+            <w:rPr>
+              <w:rFonts w:eastAsiaTheme="minorEastAsia"/>
+              <w:noProof/>
+              <w:lang w:eastAsia="ru-RU"/>
+            </w:rPr>
+          </w:pPr>
+          <w:hyperlink w:anchor="_Toc197449580" w:history="1">
+            <w:r>
+              <w:rPr>
+                <w:rStyle w:val="a5"/>
+                <w:noProof/>
+              </w:rPr>
+              <w:t>4.</w:t>
+            </w:r>
+            <w:r>
+              <w:rPr>
+                <w:rFonts w:eastAsiaTheme="minorEastAsia"/>
+                <w:noProof/>
+                <w:lang w:eastAsia="ru-RU"/>
+              </w:rPr>
+              <w:tab/>
+            </w:r>
+            <w:r>
+              <w:rPr>
+                <w:rStyle w:val="a5"/>
+                <w:noProof/>
+              </w:rPr>
+              <w:t>Требования к данным</w:t>
+            </w:r>
+            <w:r>
+              <w:rPr>
+                <w:noProof/>
+                <w:webHidden/>
+              </w:rPr>
+              <w:tab/>
+            </w:r>
+            <w:r>
+              <w:rPr>
+                <w:noProof/>
+                <w:webHidden/>
+              </w:rPr>
+              <w:fldChar w:fldCharType="begin"/>
+            </w:r>
+            <w:r>
+              <w:rPr>
+                <w:noProof/>
+                <w:webHidden/>
+              </w:rPr>
+              <w:instrText xml:space="preserve"> PAGEREF _Toc197449580 \h </w:instrText>
+            </w:r>
+            <w:r>
+              <w:rPr>
+                <w:noProof/>
+                <w:webHidden/>
+              </w:rPr>
+            </w:r>
+            <w:r>
+              <w:rPr>
+                <w:noProof/>
+                <w:webHidden/>
+              </w:rPr>
+              <w:fldChar w:fldCharType="separate"/>
+            </w:r>
+            <w:r>
+              <w:rPr>
+                <w:noProof/>
+                <w:webHidden/>
+              </w:rPr>
+              <w:t>9</w:t>
+            </w:r>
+            <w:r>
+              <w:rPr>
+                <w:noProof/>
+                <w:webHidden/>
+              </w:rPr>
+              <w:fldChar w:fldCharType="end"/>
+            </w:r>
+          </w:hyperlink>
+        </w:p>
+        <w:p>
+          <w:pPr>
+            <w:pStyle w:val="23"/>
+            <w:tabs>
+              <w:tab w:val="left" w:pos="880"/>
+              <w:tab w:val="right" w:leader="dot" w:pos="9016"/>
+            </w:tabs>
+            <w:rPr>
+              <w:rFonts w:eastAsiaTheme="minorEastAsia"/>
+              <w:noProof/>
+              <w:lang w:eastAsia="ru-RU"/>
+            </w:rPr>
+          </w:pPr>
+          <w:hyperlink w:anchor="_Toc197449581" w:history="1">
+            <w:r>
+              <w:rPr>
+                <w:rStyle w:val="a5"/>
+                <w:noProof/>
+              </w:rPr>
+              <w:t>4.1</w:t>
+            </w:r>
+            <w:r>
+              <w:rPr>
+                <w:rFonts w:eastAsiaTheme="minorEastAsia"/>
+                <w:noProof/>
+                <w:lang w:eastAsia="ru-RU"/>
+              </w:rPr>
+              <w:tab/>
+            </w:r>
+            <w:r>
+              <w:rPr>
+                <w:rStyle w:val="a5"/>
+                <w:noProof/>
+              </w:rPr>
+              <w:t>Логическая модель данных</w:t>
+            </w:r>
+            <w:r>
+              <w:rPr>
+                <w:noProof/>
+                <w:webHidden/>
+              </w:rPr>
+              <w:tab/>
+            </w:r>
+            <w:r>
+              <w:rPr>
+                <w:noProof/>
+                <w:webHidden/>
+              </w:rPr>
+              <w:fldChar w:fldCharType="begin"/>
+            </w:r>
+            <w:r>
+              <w:rPr>
+                <w:noProof/>
+                <w:webHidden/>
+              </w:rPr>
+              <w:instrText xml:space="preserve"> PAGEREF _Toc197449581 \h </w:instrText>
+            </w:r>
+            <w:r>
+              <w:rPr>
+                <w:noProof/>
+                <w:webHidden/>
+              </w:rPr>
+            </w:r>
+            <w:r>
+              <w:rPr>
+                <w:noProof/>
+                <w:webHidden/>
+              </w:rPr>
+              <w:fldChar w:fldCharType="separate"/>
+            </w:r>
+            <w:r>
+              <w:rPr>
+                <w:noProof/>
+                <w:webHidden/>
+              </w:rPr>
+              <w:t>9</w:t>
+            </w:r>
+            <w:r>
+              <w:rPr>
+                <w:noProof/>
+                <w:webHidden/>
+              </w:rPr>
+              <w:fldChar w:fldCharType="end"/>
+            </w:r>
+          </w:hyperlink>
+        </w:p>
+        <w:p>
+          <w:pPr>
+            <w:pStyle w:val="23"/>
+            <w:tabs>
+              <w:tab w:val="left" w:pos="880"/>
+              <w:tab w:val="right" w:leader="dot" w:pos="9016"/>
+            </w:tabs>
+            <w:rPr>
+              <w:rFonts w:eastAsiaTheme="minorEastAsia"/>
+              <w:noProof/>
+              <w:lang w:eastAsia="ru-RU"/>
+            </w:rPr>
+          </w:pPr>
+          <w:hyperlink w:anchor="_Toc197449582" w:history="1">
+            <w:r>
+              <w:rPr>
+                <w:rStyle w:val="a5"/>
+                <w:noProof/>
+              </w:rPr>
+              <w:t>4.2</w:t>
+            </w:r>
+            <w:r>
+              <w:rPr>
+                <w:rFonts w:eastAsiaTheme="minorEastAsia"/>
+                <w:noProof/>
+                <w:lang w:eastAsia="ru-RU"/>
+              </w:rPr>
+              <w:tab/>
+            </w:r>
+            <w:r>
+              <w:rPr>
+                <w:rStyle w:val="a5"/>
+                <w:noProof/>
+              </w:rPr>
+              <w:t>Словарь данных</w:t>
+            </w:r>
+            <w:r>
+              <w:rPr>
+                <w:noProof/>
+                <w:webHidden/>
+              </w:rPr>
+              <w:tab/>
+            </w:r>
+            <w:r>
+              <w:rPr>
+                <w:noProof/>
+                <w:webHidden/>
+              </w:rPr>
+              <w:fldChar w:fldCharType="begin"/>
+            </w:r>
+            <w:r>
+              <w:rPr>
+                <w:noProof/>
+                <w:webHidden/>
+              </w:rPr>
+              <w:instrText xml:space="preserve"> PAGEREF _Toc197449582 \h </w:instrText>
+            </w:r>
+            <w:r>
+              <w:rPr>
+                <w:noProof/>
+                <w:webHidden/>
+              </w:rPr>
+            </w:r>
+            <w:r>
+              <w:rPr>
+                <w:noProof/>
+                <w:webHidden/>
+              </w:rPr>
+              <w:fldChar w:fldCharType="separate"/>
+            </w:r>
+            <w:r>
+              <w:rPr>
+                <w:noProof/>
+                <w:webHidden/>
+              </w:rPr>
+              <w:t>10</w:t>
             </w:r>
             <w:r>
               <w:rPr>
@@ -2369,8 +3402,9 @@
         <w:pStyle w:val="1"/>
         <w:jc w:val="both"/>
       </w:pPr>
-      <w:bookmarkStart w:id="0" w:name="_Toc197445799"/>
-      <w:r>
+      <w:bookmarkStart w:id="0" w:name="_Toc197449547"/>
+      <w:r>
+        <w:lastRenderedPageBreak/>
         <w:t>Введение</w:t>
       </w:r>
       <w:bookmarkEnd w:id="0"/>
@@ -2383,7 +3417,7 @@
       <w:r>
         <w:t xml:space="preserve"> </w:t>
       </w:r>
-      <w:bookmarkStart w:id="1" w:name="_Toc197445800"/>
+      <w:bookmarkStart w:id="1" w:name="_Toc197449548"/>
       <w:r>
         <w:t>Назначение</w:t>
       </w:r>
@@ -2486,7 +3520,7 @@
       <w:r>
         <w:t xml:space="preserve"> </w:t>
       </w:r>
-      <w:bookmarkStart w:id="2" w:name="_Toc197445801"/>
+      <w:bookmarkStart w:id="2" w:name="_Toc197449549"/>
       <w:r>
         <w:t>Соглашения, принятые в документах</w:t>
       </w:r>
@@ -2513,7 +3547,6 @@
           <w:sz w:val="28"/>
           <w:szCs w:val="28"/>
         </w:rPr>
-        <w:lastRenderedPageBreak/>
         <w:t>В документации применены общепринятые правила оформления для удобства восприятия: заранее установленная терминология сохраняется во всём тексте, а структура отвечает требованиям технических стандартов с чётким разделением на заголовки, абзацы и списки. Все иллюстрации — диаграммы и схемы — снабжены поясняющими подписями, благодаря чему их содержание становится более наглядным и понятным.</w:t>
       </w:r>
     </w:p>
@@ -2536,7 +3569,7 @@
       <w:r>
         <w:t xml:space="preserve"> </w:t>
       </w:r>
-      <w:bookmarkStart w:id="3" w:name="_Toc197445802"/>
+      <w:bookmarkStart w:id="3" w:name="_Toc197449550"/>
       <w:r>
         <w:t>Границы проекта</w:t>
       </w:r>
@@ -2609,7 +3642,7 @@
       <w:r>
         <w:t xml:space="preserve"> </w:t>
       </w:r>
-      <w:bookmarkStart w:id="4" w:name="_Toc197445803"/>
+      <w:bookmarkStart w:id="4" w:name="_Toc197449551"/>
       <w:r>
         <w:t>Ссылки</w:t>
       </w:r>
@@ -2680,7 +3713,6 @@
           </w:rPr>
           <w:t>://</w:t>
         </w:r>
-        <w:proofErr w:type="spellStart"/>
         <w:r>
           <w:rPr>
             <w:rStyle w:val="a5"/>
@@ -2693,7 +3725,6 @@
           </w:rPr>
           <w:t>ru</w:t>
         </w:r>
-        <w:proofErr w:type="spellEnd"/>
         <w:r>
           <w:rPr>
             <w:rStyle w:val="a5"/>
@@ -2705,7 +3736,6 @@
           </w:rPr>
           <w:t>.</w:t>
         </w:r>
-        <w:proofErr w:type="spellStart"/>
         <w:r>
           <w:rPr>
             <w:rStyle w:val="a5"/>
@@ -2718,7 +3748,6 @@
           </w:rPr>
           <w:t>stackoverflow</w:t>
         </w:r>
-        <w:proofErr w:type="spellEnd"/>
         <w:r>
           <w:rPr>
             <w:rStyle w:val="a5"/>
@@ -2810,8 +3839,9 @@
         <w:pStyle w:val="1"/>
         <w:jc w:val="both"/>
       </w:pPr>
-      <w:bookmarkStart w:id="5" w:name="_Toc197445804"/>
-      <w:r>
+      <w:bookmarkStart w:id="5" w:name="_Toc197449552"/>
+      <w:r>
+        <w:lastRenderedPageBreak/>
         <w:t>Общее описание</w:t>
       </w:r>
       <w:bookmarkEnd w:id="5"/>
@@ -2829,7 +3859,7 @@
       <w:r>
         <w:t xml:space="preserve"> </w:t>
       </w:r>
-      <w:bookmarkStart w:id="6" w:name="_Toc197445805"/>
+      <w:bookmarkStart w:id="6" w:name="_Toc197449553"/>
       <w:r>
         <w:t>Общий взгляд на продукт</w:t>
       </w:r>
@@ -2914,7 +3944,7 @@
         </w:rPr>
         <w:t xml:space="preserve"> </w:t>
       </w:r>
-      <w:bookmarkStart w:id="7" w:name="_Toc197445806"/>
+      <w:bookmarkStart w:id="7" w:name="_Toc197449554"/>
       <w:r>
         <w:rPr>
           <w:lang w:val="be-BY"/>
@@ -2979,7 +4009,6 @@
           <w:sz w:val="28"/>
           <w:szCs w:val="28"/>
         </w:rPr>
-        <w:lastRenderedPageBreak/>
         <w:t>Администраторы: имеют полный доступ к управлению проектами, могут создавать, удалять проекты, добавлять и удалять задачи конкретным пользователям, удалять и добавлять пользователей, редактировать задачи, получать отчёты по проектам и пользователям.</w:t>
       </w:r>
     </w:p>
@@ -3034,7 +4063,7 @@
       <w:r>
         <w:t xml:space="preserve"> </w:t>
       </w:r>
-      <w:bookmarkStart w:id="8" w:name="_Toc197445807"/>
+      <w:bookmarkStart w:id="8" w:name="_Toc197449555"/>
       <w:r>
         <w:t>Операционная среда</w:t>
       </w:r>
@@ -3178,9 +4207,10 @@
         <w:jc w:val="both"/>
       </w:pPr>
       <w:r>
+        <w:lastRenderedPageBreak/>
         <w:t xml:space="preserve"> </w:t>
       </w:r>
-      <w:bookmarkStart w:id="9" w:name="_Toc197445808"/>
+      <w:bookmarkStart w:id="9" w:name="_Toc197449556"/>
       <w:r>
         <w:t>Ограничения дизайна и реализации</w:t>
       </w:r>
@@ -3341,7 +4371,7 @@
       <w:r>
         <w:t xml:space="preserve"> </w:t>
       </w:r>
-      <w:bookmarkStart w:id="10" w:name="_Toc197445809"/>
+      <w:bookmarkStart w:id="10" w:name="_Toc197449557"/>
       <w:r>
         <w:t>Предположения и зависимости</w:t>
       </w:r>
@@ -3384,7 +4414,6 @@
           <w:sz w:val="28"/>
           <w:szCs w:val="28"/>
         </w:rPr>
-        <w:lastRenderedPageBreak/>
         <w:t>Пользователи имеют стабильное и достаточно качественное подключение к Интернету, что нужно для получения и отправки данных и правильного взаимодействия с базой данных</w:t>
       </w:r>
     </w:p>
@@ -3530,7 +4559,7 @@
       <w:pPr>
         <w:pStyle w:val="1"/>
       </w:pPr>
-      <w:bookmarkStart w:id="11" w:name="_Toc197445810"/>
+      <w:bookmarkStart w:id="11" w:name="_Toc197449558"/>
       <w:r>
         <w:lastRenderedPageBreak/>
         <w:t>Функции системы</w:t>
@@ -3667,7 +4696,7 @@
       <w:r>
         <w:t xml:space="preserve"> </w:t>
       </w:r>
-      <w:bookmarkStart w:id="12" w:name="_Toc197445811"/>
+      <w:bookmarkStart w:id="12" w:name="_Toc197449559"/>
       <w:r>
         <w:t>Добавление задачи</w:t>
       </w:r>
@@ -3678,7 +4707,7 @@
       <w:pPr>
         <w:pStyle w:val="3"/>
       </w:pPr>
-      <w:bookmarkStart w:id="13" w:name="_Toc197445812"/>
+      <w:bookmarkStart w:id="13" w:name="_Toc197449560"/>
       <w:r>
         <w:t>Описание</w:t>
       </w:r>
@@ -3722,7 +4751,7 @@
       <w:pPr>
         <w:pStyle w:val="3"/>
       </w:pPr>
-      <w:bookmarkStart w:id="14" w:name="_Toc197445813"/>
+      <w:bookmarkStart w:id="14" w:name="_Toc197449561"/>
       <w:r>
         <w:lastRenderedPageBreak/>
         <w:t>Функциональные требования</w:t>
@@ -3849,7 +4878,7 @@
       <w:r>
         <w:t xml:space="preserve"> </w:t>
       </w:r>
-      <w:bookmarkStart w:id="15" w:name="_Toc197445814"/>
+      <w:bookmarkStart w:id="15" w:name="_Toc197449562"/>
       <w:r>
         <w:t>Изменение статуса задачи</w:t>
       </w:r>
@@ -3867,7 +4896,7 @@
       <w:pPr>
         <w:pStyle w:val="3"/>
       </w:pPr>
-      <w:bookmarkStart w:id="16" w:name="_Toc197445815"/>
+      <w:bookmarkStart w:id="16" w:name="_Toc197449563"/>
       <w:r>
         <w:t>Описание</w:t>
       </w:r>
@@ -3911,7 +4940,7 @@
       <w:pPr>
         <w:pStyle w:val="3"/>
       </w:pPr>
-      <w:bookmarkStart w:id="17" w:name="_Toc197445816"/>
+      <w:bookmarkStart w:id="17" w:name="_Toc197449564"/>
       <w:r>
         <w:t>Функциональные требования</w:t>
       </w:r>
@@ -4029,7 +5058,7 @@
       <w:r>
         <w:t xml:space="preserve"> </w:t>
       </w:r>
-      <w:bookmarkStart w:id="18" w:name="_Toc197445817"/>
+      <w:bookmarkStart w:id="18" w:name="_Toc197449565"/>
       <w:r>
         <w:t>Удаление задачи</w:t>
       </w:r>
@@ -4040,7 +5069,7 @@
       <w:pPr>
         <w:pStyle w:val="3"/>
       </w:pPr>
-      <w:bookmarkStart w:id="19" w:name="_Toc197445818"/>
+      <w:bookmarkStart w:id="19" w:name="_Toc197449566"/>
       <w:r>
         <w:t>Описание</w:t>
       </w:r>
@@ -4068,7 +5097,7 @@
       <w:pPr>
         <w:pStyle w:val="3"/>
       </w:pPr>
-      <w:bookmarkStart w:id="20" w:name="_Toc197445819"/>
+      <w:bookmarkStart w:id="20" w:name="_Toc197449567"/>
       <w:r>
         <w:t>Функциональные требования</w:t>
       </w:r>
@@ -4115,7 +5144,23 @@
           <w:sz w:val="28"/>
           <w:szCs w:val="28"/>
         </w:rPr>
-        <w:t>Появление с подтверждением или отменой действия для предотвращения случайных действий</w:t>
+        <w:t>Появление</w:t>
+      </w:r>
+      <w:r>
+        <w:rPr>
+          <w:rFonts w:ascii="Times New Roman" w:hAnsi="Times New Roman" w:cs="Times New Roman"/>
+          <w:sz w:val="28"/>
+          <w:szCs w:val="28"/>
+        </w:rPr>
+        <w:t xml:space="preserve"> диалогового окна</w:t>
+      </w:r>
+      <w:r>
+        <w:rPr>
+          <w:rFonts w:ascii="Times New Roman" w:hAnsi="Times New Roman" w:cs="Times New Roman"/>
+          <w:sz w:val="28"/>
+          <w:szCs w:val="28"/>
+        </w:rPr>
+        <w:t xml:space="preserve"> с подтверждением или отменой действия для предотвращения случайных действий</w:t>
       </w:r>
     </w:p>
     <w:p>
@@ -4135,7 +5180,7 @@
         <w:lastRenderedPageBreak/>
         <w:t xml:space="preserve"> </w:t>
       </w:r>
-      <w:bookmarkStart w:id="21" w:name="_Toc197445820"/>
+      <w:bookmarkStart w:id="21" w:name="_Toc197449568"/>
       <w:r>
         <w:t>Получение отчётности</w:t>
       </w:r>
@@ -4149,7 +5194,7 @@
       <w:pPr>
         <w:pStyle w:val="3"/>
       </w:pPr>
-      <w:bookmarkStart w:id="22" w:name="_Toc197445821"/>
+      <w:bookmarkStart w:id="22" w:name="_Toc197449569"/>
       <w:r>
         <w:t>Описание</w:t>
       </w:r>
@@ -4209,7 +5254,7 @@
       <w:pPr>
         <w:pStyle w:val="3"/>
       </w:pPr>
-      <w:bookmarkStart w:id="23" w:name="_Toc197445822"/>
+      <w:bookmarkStart w:id="23" w:name="_Toc197449570"/>
       <w:r>
         <w:t>Функциональные требования</w:t>
       </w:r>
@@ -4264,17 +5309,24 @@
         <w:pStyle w:val="2"/>
       </w:pPr>
       <w:r>
-        <w:t xml:space="preserve"> Добавление проекта</w:t>
-      </w:r>
+        <w:t xml:space="preserve"> </w:t>
+      </w:r>
+      <w:bookmarkStart w:id="24" w:name="_Toc197449571"/>
+      <w:r>
+        <w:t>Добавление проекта</w:t>
+      </w:r>
+      <w:bookmarkEnd w:id="24"/>
     </w:p>
     <w:p/>
     <w:p>
       <w:pPr>
         <w:pStyle w:val="3"/>
       </w:pPr>
+      <w:bookmarkStart w:id="25" w:name="_Toc197449572"/>
       <w:r>
         <w:t>Описание</w:t>
       </w:r>
+      <w:bookmarkEnd w:id="25"/>
     </w:p>
     <w:p>
       <w:pPr>
@@ -4306,9 +5358,11 @@
       <w:pPr>
         <w:pStyle w:val="3"/>
       </w:pPr>
+      <w:bookmarkStart w:id="26" w:name="_Toc197449573"/>
       <w:r>
         <w:t>Функциональные требования</w:t>
       </w:r>
+      <w:bookmarkEnd w:id="26"/>
     </w:p>
     <w:p>
       <w:pPr>
@@ -4323,6 +5377,989 @@
           <w:szCs w:val="28"/>
         </w:rPr>
       </w:pPr>
+      <w:r>
+        <w:rPr>
+          <w:rFonts w:ascii="Times New Roman" w:hAnsi="Times New Roman" w:cs="Times New Roman"/>
+          <w:sz w:val="28"/>
+          <w:szCs w:val="28"/>
+        </w:rPr>
+        <w:t>Кнопка «Добавить проект» на странице профиля администратора, обеспечивающая добавление проекта</w:t>
+      </w:r>
+    </w:p>
+    <w:p>
+      <w:pPr>
+        <w:pStyle w:val="a3"/>
+        <w:numPr>
+          <w:ilvl w:val="6"/>
+          <w:numId w:val="10"/>
+        </w:numPr>
+        <w:rPr>
+          <w:rFonts w:ascii="Times New Roman" w:hAnsi="Times New Roman" w:cs="Times New Roman"/>
+          <w:sz w:val="28"/>
+          <w:szCs w:val="28"/>
+        </w:rPr>
+      </w:pPr>
+      <w:r>
+        <w:rPr>
+          <w:rFonts w:ascii="Times New Roman" w:hAnsi="Times New Roman" w:cs="Times New Roman"/>
+          <w:sz w:val="28"/>
+          <w:szCs w:val="28"/>
+        </w:rPr>
+        <w:t>Возможность ввода информации о проекте (название, выбор методологии разработки).</w:t>
+      </w:r>
+    </w:p>
+    <w:p>
+      <w:pPr>
+        <w:pStyle w:val="a3"/>
+        <w:numPr>
+          <w:ilvl w:val="6"/>
+          <w:numId w:val="10"/>
+        </w:numPr>
+        <w:rPr>
+          <w:rFonts w:ascii="Times New Roman" w:hAnsi="Times New Roman" w:cs="Times New Roman"/>
+          <w:sz w:val="28"/>
+          <w:szCs w:val="28"/>
+        </w:rPr>
+      </w:pPr>
+      <w:r>
+        <w:rPr>
+          <w:rFonts w:ascii="Times New Roman" w:hAnsi="Times New Roman" w:cs="Times New Roman"/>
+          <w:sz w:val="28"/>
+          <w:szCs w:val="28"/>
+        </w:rPr>
+        <w:t>Возможность добавления разработчиков на проект(кнопка на странице проекта, отображающаяся только для администратора).</w:t>
+      </w:r>
+    </w:p>
+    <w:p>
+      <w:pPr>
+        <w:pStyle w:val="2"/>
+      </w:pPr>
+      <w:r>
+        <w:t xml:space="preserve"> </w:t>
+      </w:r>
+      <w:bookmarkStart w:id="27" w:name="_Toc197449574"/>
+      <w:r>
+        <w:t>Удаление проекта</w:t>
+      </w:r>
+      <w:bookmarkEnd w:id="27"/>
+    </w:p>
+    <w:p/>
+    <w:p>
+      <w:pPr>
+        <w:pStyle w:val="3"/>
+      </w:pPr>
+      <w:bookmarkStart w:id="28" w:name="_Toc197449575"/>
+      <w:r>
+        <w:t>Описание</w:t>
+      </w:r>
+      <w:bookmarkEnd w:id="28"/>
+    </w:p>
+    <w:p>
+      <w:pPr>
+        <w:ind w:firstLine="708"/>
+        <w:rPr>
+          <w:rFonts w:ascii="Times New Roman" w:hAnsi="Times New Roman" w:cs="Times New Roman"/>
+          <w:sz w:val="28"/>
+          <w:szCs w:val="28"/>
+        </w:rPr>
+      </w:pPr>
+      <w:r>
+        <w:rPr>
+          <w:rFonts w:ascii="Times New Roman" w:hAnsi="Times New Roman" w:cs="Times New Roman"/>
+          <w:sz w:val="28"/>
+          <w:szCs w:val="28"/>
+        </w:rPr>
+        <w:t>ы</w:t>
+      </w:r>
+      <w:r>
+        <w:rPr>
+          <w:rFonts w:ascii="Times New Roman" w:hAnsi="Times New Roman" w:cs="Times New Roman"/>
+          <w:sz w:val="28"/>
+          <w:szCs w:val="28"/>
+        </w:rPr>
+        <w:t>Функция позволяет администратору удалить проект и автоматически открепить всех разработчиков от этого проекта. Также вместе с проектом удаляются все задачи, созданные на этом проекте.</w:t>
+      </w:r>
+    </w:p>
+    <w:p>
+      <w:pPr>
+        <w:pStyle w:val="3"/>
+      </w:pPr>
+      <w:bookmarkStart w:id="29" w:name="_Toc197449576"/>
+      <w:r>
+        <w:t>Функциональные требования</w:t>
+      </w:r>
+      <w:bookmarkEnd w:id="29"/>
+    </w:p>
+    <w:p/>
+    <w:p>
+      <w:pPr>
+        <w:pStyle w:val="a3"/>
+        <w:numPr>
+          <w:ilvl w:val="6"/>
+          <w:numId w:val="10"/>
+        </w:numPr>
+        <w:rPr>
+          <w:rFonts w:ascii="Times New Roman" w:hAnsi="Times New Roman" w:cs="Times New Roman"/>
+          <w:sz w:val="28"/>
+          <w:szCs w:val="28"/>
+        </w:rPr>
+      </w:pPr>
+      <w:r>
+        <w:rPr>
+          <w:rFonts w:ascii="Times New Roman" w:hAnsi="Times New Roman" w:cs="Times New Roman"/>
+          <w:sz w:val="28"/>
+          <w:szCs w:val="28"/>
+        </w:rPr>
+        <w:lastRenderedPageBreak/>
+        <w:t>Кнопка «Удалить проект» на странице проекта, отображающаяся только для администратора, обеспечивающая удаление проекта.</w:t>
+      </w:r>
+    </w:p>
+    <w:p>
+      <w:pPr>
+        <w:pStyle w:val="a3"/>
+        <w:numPr>
+          <w:ilvl w:val="6"/>
+          <w:numId w:val="10"/>
+        </w:numPr>
+        <w:rPr>
+          <w:rFonts w:ascii="Times New Roman" w:hAnsi="Times New Roman" w:cs="Times New Roman"/>
+          <w:sz w:val="28"/>
+          <w:szCs w:val="28"/>
+        </w:rPr>
+      </w:pPr>
+      <w:r>
+        <w:rPr>
+          <w:rFonts w:ascii="Times New Roman" w:hAnsi="Times New Roman" w:cs="Times New Roman"/>
+          <w:sz w:val="28"/>
+          <w:szCs w:val="28"/>
+        </w:rPr>
+        <w:t>Автоматическое удаление всех задач, созданных на этом проекте и открепление всех разработчиков от этого проекта.</w:t>
+      </w:r>
+    </w:p>
+    <w:p>
+      <w:pPr>
+        <w:pStyle w:val="a3"/>
+        <w:numPr>
+          <w:ilvl w:val="6"/>
+          <w:numId w:val="10"/>
+        </w:numPr>
+        <w:rPr>
+          <w:rFonts w:ascii="Times New Roman" w:hAnsi="Times New Roman" w:cs="Times New Roman"/>
+          <w:sz w:val="28"/>
+          <w:szCs w:val="28"/>
+        </w:rPr>
+      </w:pPr>
+      <w:r>
+        <w:rPr>
+          <w:rFonts w:ascii="Times New Roman" w:hAnsi="Times New Roman" w:cs="Times New Roman"/>
+          <w:sz w:val="28"/>
+          <w:szCs w:val="28"/>
+        </w:rPr>
+        <w:t>Появления диалогового окна с подтверждением или отменой действия для предотвращения случайного удаления</w:t>
+      </w:r>
+    </w:p>
+    <w:p>
+      <w:pPr>
+        <w:pStyle w:val="2"/>
+      </w:pPr>
+      <w:r>
+        <w:t xml:space="preserve"> </w:t>
+      </w:r>
+      <w:bookmarkStart w:id="30" w:name="_Toc197449577"/>
+      <w:r>
+        <w:t>Прикрепление</w:t>
+      </w:r>
+      <w:r>
+        <w:t>/открепление</w:t>
+      </w:r>
+      <w:r>
+        <w:t xml:space="preserve"> разработчиков на проект</w:t>
+      </w:r>
+      <w:r>
+        <w:t>/с проекта</w:t>
+      </w:r>
+      <w:bookmarkEnd w:id="30"/>
+    </w:p>
+    <w:p>
+      <w:pPr>
+        <w:rPr>
+          <w:rFonts w:ascii="Times New Roman" w:hAnsi="Times New Roman" w:cs="Times New Roman"/>
+          <w:sz w:val="28"/>
+          <w:szCs w:val="28"/>
+        </w:rPr>
+      </w:pPr>
+    </w:p>
+    <w:p>
+      <w:pPr>
+        <w:pStyle w:val="3"/>
+      </w:pPr>
+      <w:bookmarkStart w:id="31" w:name="_Toc197449578"/>
+      <w:r>
+        <w:t>Описание</w:t>
+      </w:r>
+      <w:bookmarkEnd w:id="31"/>
+    </w:p>
+    <w:p>
+      <w:pPr>
+        <w:ind w:firstLine="708"/>
+        <w:rPr>
+          <w:rFonts w:ascii="Times New Roman" w:hAnsi="Times New Roman" w:cs="Times New Roman"/>
+          <w:sz w:val="28"/>
+          <w:szCs w:val="28"/>
+        </w:rPr>
+      </w:pPr>
+      <w:r>
+        <w:rPr>
+          <w:rFonts w:ascii="Times New Roman" w:hAnsi="Times New Roman" w:cs="Times New Roman"/>
+          <w:sz w:val="28"/>
+          <w:szCs w:val="28"/>
+        </w:rPr>
+        <w:t xml:space="preserve">Функция позволяет администратору прикреплять новых разработчиков на проект и откреплять уже прикреплённых с проекта. Для этого на странице проекта для администратора </w:t>
+      </w:r>
+      <w:r>
+        <w:rPr>
+          <w:rFonts w:ascii="Times New Roman" w:hAnsi="Times New Roman" w:cs="Times New Roman"/>
+          <w:sz w:val="28"/>
+          <w:szCs w:val="28"/>
+        </w:rPr>
+        <w:t>должна отображаться соответствующая кнопка.</w:t>
+      </w:r>
+    </w:p>
+    <w:p>
+      <w:pPr>
+        <w:pStyle w:val="3"/>
+      </w:pPr>
+      <w:bookmarkStart w:id="32" w:name="_Toc197449579"/>
+      <w:r>
+        <w:t>Функциональные требования</w:t>
+      </w:r>
+      <w:bookmarkEnd w:id="32"/>
+    </w:p>
+    <w:p>
+      <w:pPr>
+        <w:pStyle w:val="a3"/>
+        <w:numPr>
+          <w:ilvl w:val="6"/>
+          <w:numId w:val="10"/>
+        </w:numPr>
+        <w:rPr>
+          <w:rFonts w:ascii="Times New Roman" w:hAnsi="Times New Roman" w:cs="Times New Roman"/>
+          <w:sz w:val="28"/>
+          <w:szCs w:val="28"/>
+        </w:rPr>
+      </w:pPr>
+      <w:r>
+        <w:rPr>
+          <w:rFonts w:ascii="Times New Roman" w:hAnsi="Times New Roman" w:cs="Times New Roman"/>
+          <w:sz w:val="28"/>
+          <w:szCs w:val="28"/>
+        </w:rPr>
+        <w:t>Кнопка «Добавить разработчиков», отображающаяся только для администратора на странице проекта, которая выводит диалоговое окно, позволяющее выбрать конкретных разработчиков и добавить их на проект.</w:t>
+      </w:r>
+    </w:p>
+    <w:p>
+      <w:pPr>
+        <w:pStyle w:val="a3"/>
+        <w:numPr>
+          <w:ilvl w:val="6"/>
+          <w:numId w:val="10"/>
+        </w:numPr>
+        <w:rPr>
+          <w:rFonts w:ascii="Times New Roman" w:hAnsi="Times New Roman" w:cs="Times New Roman"/>
+          <w:sz w:val="28"/>
+          <w:szCs w:val="28"/>
+        </w:rPr>
+      </w:pPr>
+      <w:r>
+        <w:rPr>
+          <w:rFonts w:ascii="Times New Roman" w:hAnsi="Times New Roman" w:cs="Times New Roman"/>
+          <w:sz w:val="28"/>
+          <w:szCs w:val="28"/>
+        </w:rPr>
+        <w:t>Механизмы контроля, предусматривающие проверку количества проектов у каждого разработчика перед добавлением его на проект. В случае попытки превышения лимита должно выводиться сообщение, содержащее информацию о разработчике и причину, по которой он не может быть добавлен на проект.</w:t>
+      </w:r>
+    </w:p>
+    <w:p>
+      <w:pPr>
+        <w:pStyle w:val="1"/>
+      </w:pPr>
+      <w:bookmarkStart w:id="33" w:name="_Toc197449580"/>
+      <w:r>
+        <w:t>Требования к данным</w:t>
+      </w:r>
+      <w:bookmarkEnd w:id="33"/>
+    </w:p>
+    <w:p/>
+    <w:p>
+      <w:pPr>
+        <w:pStyle w:val="2"/>
+      </w:pPr>
+      <w:r>
+        <w:t xml:space="preserve"> </w:t>
+      </w:r>
+      <w:bookmarkStart w:id="34" w:name="_Toc197449581"/>
+      <w:r>
+        <w:t>Логическая модель данных</w:t>
+      </w:r>
+      <w:bookmarkEnd w:id="34"/>
+    </w:p>
+    <w:p>
+      <w:pPr>
+        <w:ind w:firstLine="357"/>
+        <w:rPr>
+          <w:rFonts w:ascii="Times New Roman" w:hAnsi="Times New Roman" w:cs="Times New Roman"/>
+          <w:sz w:val="28"/>
+          <w:szCs w:val="28"/>
+        </w:rPr>
+      </w:pPr>
+      <w:r>
+        <w:rPr>
+          <w:rFonts w:ascii="Times New Roman" w:hAnsi="Times New Roman" w:cs="Times New Roman"/>
+          <w:sz w:val="28"/>
+          <w:szCs w:val="28"/>
+        </w:rPr>
+        <w:t>Логическая модель данных описывает главные сущности и связи между ними в системе «Система управления проектами»</w:t>
+      </w:r>
+      <w:r>
+        <w:rPr>
+          <w:rFonts w:ascii="Times New Roman" w:hAnsi="Times New Roman" w:cs="Times New Roman"/>
+          <w:sz w:val="28"/>
+          <w:szCs w:val="28"/>
+        </w:rPr>
+        <w:t>:</w:t>
+      </w:r>
+    </w:p>
+    <w:p>
+      <w:pPr>
+        <w:pStyle w:val="a3"/>
+        <w:numPr>
+          <w:ilvl w:val="6"/>
+          <w:numId w:val="10"/>
+        </w:numPr>
+        <w:rPr>
+          <w:rFonts w:ascii="Times New Roman" w:hAnsi="Times New Roman" w:cs="Times New Roman"/>
+          <w:sz w:val="28"/>
+          <w:szCs w:val="28"/>
+        </w:rPr>
+      </w:pPr>
+      <w:r>
+        <w:rPr>
+          <w:rFonts w:ascii="Times New Roman" w:hAnsi="Times New Roman" w:cs="Times New Roman"/>
+          <w:sz w:val="28"/>
+          <w:szCs w:val="28"/>
+        </w:rPr>
+        <w:t xml:space="preserve">Проекты:  </w:t>
+      </w:r>
+      <w:r>
+        <w:rPr>
+          <w:rFonts w:ascii="Times New Roman" w:hAnsi="Times New Roman" w:cs="Times New Roman"/>
+          <w:sz w:val="28"/>
+          <w:szCs w:val="28"/>
+          <w:lang w:val="en-US"/>
+        </w:rPr>
+        <w:t>ID</w:t>
+      </w:r>
+      <w:r>
+        <w:rPr>
+          <w:rFonts w:ascii="Times New Roman" w:hAnsi="Times New Roman" w:cs="Times New Roman"/>
+          <w:sz w:val="28"/>
+          <w:szCs w:val="28"/>
+        </w:rPr>
+        <w:t xml:space="preserve"> </w:t>
+      </w:r>
+      <w:r>
+        <w:rPr>
+          <w:rFonts w:ascii="Times New Roman" w:hAnsi="Times New Roman" w:cs="Times New Roman"/>
+          <w:sz w:val="28"/>
+          <w:szCs w:val="28"/>
+        </w:rPr>
+        <w:t>проекта, название проекта, название методологии разработки</w:t>
+      </w:r>
+    </w:p>
+    <w:p>
+      <w:pPr>
+        <w:pStyle w:val="a3"/>
+        <w:numPr>
+          <w:ilvl w:val="6"/>
+          <w:numId w:val="10"/>
+        </w:numPr>
+        <w:rPr>
+          <w:rFonts w:ascii="Times New Roman" w:hAnsi="Times New Roman" w:cs="Times New Roman"/>
+          <w:sz w:val="28"/>
+          <w:szCs w:val="28"/>
+        </w:rPr>
+      </w:pPr>
+      <w:r>
+        <w:rPr>
+          <w:rFonts w:ascii="Times New Roman" w:hAnsi="Times New Roman" w:cs="Times New Roman"/>
+          <w:sz w:val="28"/>
+          <w:szCs w:val="28"/>
+        </w:rPr>
+        <w:t xml:space="preserve">Задачи: </w:t>
+      </w:r>
+      <w:r>
+        <w:rPr>
+          <w:rFonts w:ascii="Times New Roman" w:hAnsi="Times New Roman" w:cs="Times New Roman"/>
+          <w:sz w:val="28"/>
+          <w:szCs w:val="28"/>
+          <w:lang w:val="en-US"/>
+        </w:rPr>
+        <w:t>ID</w:t>
+      </w:r>
+      <w:r>
+        <w:rPr>
+          <w:rFonts w:ascii="Times New Roman" w:hAnsi="Times New Roman" w:cs="Times New Roman"/>
+          <w:sz w:val="28"/>
+          <w:szCs w:val="28"/>
+        </w:rPr>
+        <w:t xml:space="preserve">, </w:t>
+      </w:r>
+      <w:r>
+        <w:rPr>
+          <w:rFonts w:ascii="Times New Roman" w:hAnsi="Times New Roman" w:cs="Times New Roman"/>
+          <w:sz w:val="28"/>
+          <w:szCs w:val="28"/>
+        </w:rPr>
+        <w:t xml:space="preserve">Название задачи, её статус, описание (краткое и полное), </w:t>
+      </w:r>
+      <w:r>
+        <w:rPr>
+          <w:rFonts w:ascii="Times New Roman" w:hAnsi="Times New Roman" w:cs="Times New Roman"/>
+          <w:sz w:val="28"/>
+          <w:szCs w:val="28"/>
+        </w:rPr>
+        <w:t xml:space="preserve">примечания, разработчик, </w:t>
+      </w:r>
+      <w:r>
+        <w:rPr>
+          <w:rFonts w:ascii="Times New Roman" w:hAnsi="Times New Roman" w:cs="Times New Roman"/>
+          <w:sz w:val="28"/>
+          <w:szCs w:val="28"/>
+        </w:rPr>
+        <w:lastRenderedPageBreak/>
+        <w:t>которому прикреплена задача</w:t>
+      </w:r>
+      <w:r>
+        <w:rPr>
+          <w:rFonts w:ascii="Times New Roman" w:hAnsi="Times New Roman" w:cs="Times New Roman"/>
+          <w:sz w:val="28"/>
+          <w:szCs w:val="28"/>
+        </w:rPr>
+        <w:t>,</w:t>
+      </w:r>
+      <w:r>
+        <w:rPr>
+          <w:rFonts w:ascii="Times New Roman" w:hAnsi="Times New Roman" w:cs="Times New Roman"/>
+          <w:sz w:val="28"/>
+          <w:szCs w:val="28"/>
+          <w:lang w:val="en-US"/>
+        </w:rPr>
+        <w:t>id</w:t>
+      </w:r>
+      <w:r>
+        <w:rPr>
+          <w:rFonts w:ascii="Times New Roman" w:hAnsi="Times New Roman" w:cs="Times New Roman"/>
+          <w:sz w:val="28"/>
+          <w:szCs w:val="28"/>
+        </w:rPr>
+        <w:t xml:space="preserve"> </w:t>
+      </w:r>
+      <w:r>
+        <w:rPr>
+          <w:rFonts w:ascii="Times New Roman" w:hAnsi="Times New Roman" w:cs="Times New Roman"/>
+          <w:sz w:val="28"/>
+          <w:szCs w:val="28"/>
+        </w:rPr>
+        <w:t>проекта, в рамках которого создана задача</w:t>
+      </w:r>
+    </w:p>
+    <w:p>
+      <w:pPr>
+        <w:pStyle w:val="a3"/>
+        <w:numPr>
+          <w:ilvl w:val="6"/>
+          <w:numId w:val="10"/>
+        </w:numPr>
+        <w:rPr>
+          <w:rFonts w:ascii="Times New Roman" w:hAnsi="Times New Roman" w:cs="Times New Roman"/>
+          <w:sz w:val="28"/>
+          <w:szCs w:val="28"/>
+        </w:rPr>
+      </w:pPr>
+      <w:r>
+        <w:rPr>
+          <w:rFonts w:ascii="Times New Roman" w:hAnsi="Times New Roman" w:cs="Times New Roman"/>
+          <w:sz w:val="28"/>
+          <w:szCs w:val="28"/>
+        </w:rPr>
+        <w:t xml:space="preserve">Разработчики: </w:t>
+      </w:r>
+      <w:r>
+        <w:rPr>
+          <w:rFonts w:ascii="Times New Roman" w:hAnsi="Times New Roman" w:cs="Times New Roman"/>
+          <w:sz w:val="28"/>
+          <w:szCs w:val="28"/>
+          <w:lang w:val="en-US"/>
+        </w:rPr>
+        <w:t>ID</w:t>
+      </w:r>
+      <w:r>
+        <w:rPr>
+          <w:rFonts w:ascii="Times New Roman" w:hAnsi="Times New Roman" w:cs="Times New Roman"/>
+          <w:sz w:val="28"/>
+          <w:szCs w:val="28"/>
+        </w:rPr>
+        <w:t xml:space="preserve"> </w:t>
+      </w:r>
+      <w:r>
+        <w:rPr>
+          <w:rFonts w:ascii="Times New Roman" w:hAnsi="Times New Roman" w:cs="Times New Roman"/>
+          <w:sz w:val="28"/>
+          <w:szCs w:val="28"/>
+        </w:rPr>
+        <w:t xml:space="preserve">разработчика, </w:t>
+      </w:r>
+      <w:r>
+        <w:rPr>
+          <w:rFonts w:ascii="Times New Roman" w:hAnsi="Times New Roman" w:cs="Times New Roman"/>
+          <w:sz w:val="28"/>
+          <w:szCs w:val="28"/>
+          <w:lang w:val="en-US"/>
+        </w:rPr>
+        <w:t>Username</w:t>
+      </w:r>
+      <w:r>
+        <w:rPr>
+          <w:rFonts w:ascii="Times New Roman" w:hAnsi="Times New Roman" w:cs="Times New Roman"/>
+          <w:sz w:val="28"/>
+          <w:szCs w:val="28"/>
+        </w:rPr>
+        <w:t xml:space="preserve"> </w:t>
+      </w:r>
+      <w:r>
+        <w:rPr>
+          <w:rFonts w:ascii="Times New Roman" w:hAnsi="Times New Roman" w:cs="Times New Roman"/>
+          <w:sz w:val="28"/>
+          <w:szCs w:val="28"/>
+        </w:rPr>
+        <w:t>разработчика, почта, должность, проекты, на которые прикреплен разработчик</w:t>
+      </w:r>
+      <w:r>
+        <w:rPr>
+          <w:rFonts w:ascii="Times New Roman" w:hAnsi="Times New Roman" w:cs="Times New Roman"/>
+          <w:sz w:val="28"/>
+          <w:szCs w:val="28"/>
+        </w:rPr>
+        <w:t>, роль</w:t>
+      </w:r>
+      <w:r>
+        <w:rPr>
+          <w:rFonts w:ascii="Times New Roman" w:hAnsi="Times New Roman" w:cs="Times New Roman"/>
+          <w:sz w:val="28"/>
+          <w:szCs w:val="28"/>
+        </w:rPr>
+        <w:t xml:space="preserve"> </w:t>
+      </w:r>
+      <w:r>
+        <w:rPr>
+          <w:rFonts w:ascii="Times New Roman" w:hAnsi="Times New Roman" w:cs="Times New Roman"/>
+          <w:sz w:val="28"/>
+          <w:szCs w:val="28"/>
+        </w:rPr>
+        <w:t>(Администратор/пользователь).</w:t>
+      </w:r>
+    </w:p>
+    <w:p>
+      <w:pPr>
+        <w:pStyle w:val="2"/>
+      </w:pPr>
+      <w:bookmarkStart w:id="35" w:name="_Toc197449582"/>
+      <w:r>
+        <w:t>Словарь данных</w:t>
+      </w:r>
+      <w:bookmarkEnd w:id="35"/>
+    </w:p>
+    <w:p>
+      <w:pPr>
+        <w:rPr>
+          <w:rFonts w:ascii="Times New Roman" w:hAnsi="Times New Roman" w:cs="Times New Roman"/>
+          <w:sz w:val="28"/>
+          <w:szCs w:val="28"/>
+        </w:rPr>
+      </w:pPr>
+      <w:r>
+        <w:rPr>
+          <w:rFonts w:ascii="Times New Roman" w:hAnsi="Times New Roman" w:cs="Times New Roman"/>
+          <w:sz w:val="28"/>
+          <w:szCs w:val="28"/>
+        </w:rPr>
+        <w:t>Словарь данных программного средства «Система управления проектами» включает в себя следующие описани</w:t>
+      </w:r>
+      <w:r>
+        <w:rPr>
+          <w:rFonts w:ascii="Times New Roman" w:hAnsi="Times New Roman" w:cs="Times New Roman"/>
+          <w:sz w:val="28"/>
+          <w:szCs w:val="28"/>
+        </w:rPr>
+        <w:t>я:</w:t>
+      </w:r>
+    </w:p>
+    <w:p>
+      <w:pPr>
+        <w:rPr>
+          <w:rFonts w:ascii="Times New Roman" w:hAnsi="Times New Roman" w:cs="Times New Roman"/>
+          <w:sz w:val="28"/>
+          <w:szCs w:val="28"/>
+          <w:u w:val="single"/>
+        </w:rPr>
+      </w:pPr>
+      <w:r>
+        <w:rPr>
+          <w:rFonts w:ascii="Times New Roman" w:hAnsi="Times New Roman" w:cs="Times New Roman"/>
+          <w:sz w:val="28"/>
+          <w:szCs w:val="28"/>
+          <w:u w:val="single"/>
+        </w:rPr>
+        <w:t>Проекты:</w:t>
+      </w:r>
+    </w:p>
+    <w:p>
+      <w:pPr>
+        <w:pStyle w:val="a3"/>
+        <w:numPr>
+          <w:ilvl w:val="0"/>
+          <w:numId w:val="13"/>
+        </w:numPr>
+        <w:rPr>
+          <w:rFonts w:ascii="Times New Roman" w:hAnsi="Times New Roman" w:cs="Times New Roman"/>
+          <w:sz w:val="28"/>
+          <w:szCs w:val="28"/>
+        </w:rPr>
+      </w:pPr>
+      <w:r>
+        <w:rPr>
+          <w:rFonts w:ascii="Times New Roman" w:hAnsi="Times New Roman" w:cs="Times New Roman"/>
+          <w:sz w:val="28"/>
+          <w:szCs w:val="28"/>
+          <w:lang w:val="en-US"/>
+        </w:rPr>
+        <w:t>ID</w:t>
+      </w:r>
+      <w:r>
+        <w:rPr>
+          <w:rFonts w:ascii="Times New Roman" w:hAnsi="Times New Roman" w:cs="Times New Roman"/>
+          <w:sz w:val="28"/>
+          <w:szCs w:val="28"/>
+        </w:rPr>
+        <w:t xml:space="preserve"> </w:t>
+      </w:r>
+      <w:r>
+        <w:rPr>
+          <w:rFonts w:ascii="Times New Roman" w:hAnsi="Times New Roman" w:cs="Times New Roman"/>
+          <w:sz w:val="28"/>
+          <w:szCs w:val="28"/>
+        </w:rPr>
+        <w:t>(</w:t>
+      </w:r>
+      <w:r>
+        <w:rPr>
+          <w:rFonts w:ascii="Times New Roman" w:hAnsi="Times New Roman" w:cs="Times New Roman"/>
+          <w:sz w:val="28"/>
+          <w:szCs w:val="28"/>
+        </w:rPr>
+        <w:t>число</w:t>
+      </w:r>
+      <w:r>
+        <w:rPr>
+          <w:rFonts w:ascii="Times New Roman" w:hAnsi="Times New Roman" w:cs="Times New Roman"/>
+          <w:sz w:val="28"/>
+          <w:szCs w:val="28"/>
+        </w:rPr>
+        <w:t>)</w:t>
+      </w:r>
+      <w:r>
+        <w:rPr>
+          <w:rFonts w:ascii="Times New Roman" w:hAnsi="Times New Roman" w:cs="Times New Roman"/>
+          <w:sz w:val="28"/>
+          <w:szCs w:val="28"/>
+        </w:rPr>
+        <w:t xml:space="preserve"> – Уникальный числовой идентификатор проекта</w:t>
+      </w:r>
+    </w:p>
+    <w:p>
+      <w:pPr>
+        <w:pStyle w:val="a3"/>
+        <w:numPr>
+          <w:ilvl w:val="0"/>
+          <w:numId w:val="13"/>
+        </w:numPr>
+        <w:rPr>
+          <w:rFonts w:ascii="Times New Roman" w:hAnsi="Times New Roman" w:cs="Times New Roman"/>
+          <w:sz w:val="28"/>
+          <w:szCs w:val="28"/>
+        </w:rPr>
+      </w:pPr>
+      <w:r>
+        <w:rPr>
+          <w:rFonts w:ascii="Times New Roman" w:hAnsi="Times New Roman" w:cs="Times New Roman"/>
+          <w:sz w:val="28"/>
+          <w:szCs w:val="28"/>
+        </w:rPr>
+        <w:t xml:space="preserve">Название (строка) </w:t>
+      </w:r>
+      <w:r>
+        <w:rPr>
+          <w:rFonts w:ascii="Times New Roman" w:hAnsi="Times New Roman" w:cs="Times New Roman"/>
+          <w:sz w:val="28"/>
+          <w:szCs w:val="28"/>
+        </w:rPr>
+        <w:t>–</w:t>
+      </w:r>
+      <w:r>
+        <w:rPr>
+          <w:rFonts w:ascii="Times New Roman" w:hAnsi="Times New Roman" w:cs="Times New Roman"/>
+          <w:sz w:val="28"/>
+          <w:szCs w:val="28"/>
+        </w:rPr>
+        <w:t xml:space="preserve"> </w:t>
+      </w:r>
+      <w:r>
+        <w:rPr>
+          <w:rFonts w:ascii="Times New Roman" w:hAnsi="Times New Roman" w:cs="Times New Roman"/>
+          <w:sz w:val="28"/>
+          <w:szCs w:val="28"/>
+        </w:rPr>
+        <w:t>наименование проекта</w:t>
+      </w:r>
+    </w:p>
+    <w:p>
+      <w:pPr>
+        <w:pStyle w:val="a3"/>
+        <w:numPr>
+          <w:ilvl w:val="0"/>
+          <w:numId w:val="13"/>
+        </w:numPr>
+        <w:rPr>
+          <w:rFonts w:ascii="Times New Roman" w:hAnsi="Times New Roman" w:cs="Times New Roman"/>
+          <w:sz w:val="28"/>
+          <w:szCs w:val="28"/>
+        </w:rPr>
+      </w:pPr>
+      <w:r>
+        <w:rPr>
+          <w:rFonts w:ascii="Times New Roman" w:hAnsi="Times New Roman" w:cs="Times New Roman"/>
+          <w:sz w:val="28"/>
+          <w:szCs w:val="28"/>
+        </w:rPr>
+        <w:t>Методология разработки (строка) – Наименование методологии разработки, используемой на проекте.</w:t>
+      </w:r>
+    </w:p>
+    <w:p>
+      <w:pPr>
+        <w:rPr>
+          <w:rFonts w:ascii="Times New Roman" w:hAnsi="Times New Roman" w:cs="Times New Roman"/>
+          <w:sz w:val="28"/>
+          <w:szCs w:val="28"/>
+          <w:u w:val="single"/>
+        </w:rPr>
+      </w:pPr>
+      <w:r>
+        <w:rPr>
+          <w:rFonts w:ascii="Times New Roman" w:hAnsi="Times New Roman" w:cs="Times New Roman"/>
+          <w:sz w:val="28"/>
+          <w:szCs w:val="28"/>
+          <w:u w:val="single"/>
+        </w:rPr>
+        <w:t>Задачи:</w:t>
+      </w:r>
+    </w:p>
+    <w:p>
+      <w:pPr>
+        <w:pStyle w:val="a3"/>
+        <w:numPr>
+          <w:ilvl w:val="0"/>
+          <w:numId w:val="14"/>
+        </w:numPr>
+        <w:rPr>
+          <w:rFonts w:ascii="Times New Roman" w:hAnsi="Times New Roman" w:cs="Times New Roman"/>
+          <w:sz w:val="28"/>
+          <w:szCs w:val="28"/>
+          <w:u w:val="single"/>
+        </w:rPr>
+      </w:pPr>
+      <w:r>
+        <w:rPr>
+          <w:rFonts w:ascii="Times New Roman" w:hAnsi="Times New Roman" w:cs="Times New Roman"/>
+          <w:sz w:val="28"/>
+          <w:szCs w:val="28"/>
+          <w:lang w:val="en-US"/>
+        </w:rPr>
+        <w:t>ID</w:t>
+      </w:r>
+      <w:r>
+        <w:rPr>
+          <w:rFonts w:ascii="Times New Roman" w:hAnsi="Times New Roman" w:cs="Times New Roman"/>
+          <w:sz w:val="28"/>
+          <w:szCs w:val="28"/>
+        </w:rPr>
+        <w:t>(</w:t>
+      </w:r>
+      <w:r>
+        <w:rPr>
+          <w:rFonts w:ascii="Times New Roman" w:hAnsi="Times New Roman" w:cs="Times New Roman"/>
+          <w:sz w:val="28"/>
+          <w:szCs w:val="28"/>
+        </w:rPr>
+        <w:t>число</w:t>
+      </w:r>
+      <w:r>
+        <w:rPr>
+          <w:rFonts w:ascii="Times New Roman" w:hAnsi="Times New Roman" w:cs="Times New Roman"/>
+          <w:sz w:val="28"/>
+          <w:szCs w:val="28"/>
+        </w:rPr>
+        <w:t>)</w:t>
+      </w:r>
+      <w:r>
+        <w:rPr>
+          <w:rFonts w:ascii="Times New Roman" w:hAnsi="Times New Roman" w:cs="Times New Roman"/>
+          <w:sz w:val="28"/>
+          <w:szCs w:val="28"/>
+        </w:rPr>
+        <w:t xml:space="preserve"> – Уникальный числовой идентификатор задачи</w:t>
+      </w:r>
+    </w:p>
+    <w:p>
+      <w:pPr>
+        <w:pStyle w:val="a3"/>
+        <w:numPr>
+          <w:ilvl w:val="0"/>
+          <w:numId w:val="14"/>
+        </w:numPr>
+        <w:rPr>
+          <w:rFonts w:ascii="Times New Roman" w:hAnsi="Times New Roman" w:cs="Times New Roman"/>
+          <w:sz w:val="28"/>
+          <w:szCs w:val="28"/>
+          <w:u w:val="single"/>
+        </w:rPr>
+      </w:pPr>
+      <w:r>
+        <w:rPr>
+          <w:rFonts w:ascii="Times New Roman" w:hAnsi="Times New Roman" w:cs="Times New Roman"/>
+          <w:sz w:val="28"/>
+          <w:szCs w:val="28"/>
+        </w:rPr>
+        <w:t>Название(строка) – наименование задачи</w:t>
+      </w:r>
+    </w:p>
+    <w:p>
+      <w:pPr>
+        <w:pStyle w:val="a3"/>
+        <w:numPr>
+          <w:ilvl w:val="0"/>
+          <w:numId w:val="14"/>
+        </w:numPr>
+        <w:rPr>
+          <w:rFonts w:ascii="Times New Roman" w:hAnsi="Times New Roman" w:cs="Times New Roman"/>
+          <w:sz w:val="28"/>
+          <w:szCs w:val="28"/>
+          <w:u w:val="single"/>
+        </w:rPr>
+      </w:pPr>
+      <w:r>
+        <w:rPr>
+          <w:rFonts w:ascii="Times New Roman" w:hAnsi="Times New Roman" w:cs="Times New Roman"/>
+          <w:sz w:val="28"/>
+          <w:szCs w:val="28"/>
+        </w:rPr>
+        <w:t>Статус(строка) – статус задачи в данный момент</w:t>
+      </w:r>
+    </w:p>
+    <w:p>
+      <w:pPr>
+        <w:pStyle w:val="a3"/>
+        <w:numPr>
+          <w:ilvl w:val="0"/>
+          <w:numId w:val="14"/>
+        </w:numPr>
+        <w:rPr>
+          <w:rFonts w:ascii="Times New Roman" w:hAnsi="Times New Roman" w:cs="Times New Roman"/>
+          <w:sz w:val="28"/>
+          <w:szCs w:val="28"/>
+          <w:u w:val="single"/>
+        </w:rPr>
+      </w:pPr>
+      <w:r>
+        <w:rPr>
+          <w:rFonts w:ascii="Times New Roman" w:hAnsi="Times New Roman" w:cs="Times New Roman"/>
+          <w:sz w:val="28"/>
+          <w:szCs w:val="28"/>
+        </w:rPr>
+        <w:t>Краткое описание(строка) – краткое описание задачи, отображаемое на карточке задачи</w:t>
+      </w:r>
+    </w:p>
+    <w:p>
+      <w:pPr>
+        <w:pStyle w:val="a3"/>
+        <w:numPr>
+          <w:ilvl w:val="0"/>
+          <w:numId w:val="14"/>
+        </w:numPr>
+        <w:rPr>
+          <w:rFonts w:ascii="Times New Roman" w:hAnsi="Times New Roman" w:cs="Times New Roman"/>
+          <w:sz w:val="28"/>
+          <w:szCs w:val="28"/>
+          <w:u w:val="single"/>
+        </w:rPr>
+      </w:pPr>
+      <w:r>
+        <w:rPr>
+          <w:rFonts w:ascii="Times New Roman" w:hAnsi="Times New Roman" w:cs="Times New Roman"/>
+          <w:sz w:val="28"/>
+          <w:szCs w:val="28"/>
+        </w:rPr>
+        <w:t>Полное описание(строка) - полное описание задачи, отображаемое при  просмотре подробной информации по задаче</w:t>
+      </w:r>
+    </w:p>
+    <w:p>
+      <w:pPr>
+        <w:pStyle w:val="a3"/>
+        <w:numPr>
+          <w:ilvl w:val="0"/>
+          <w:numId w:val="14"/>
+        </w:numPr>
+        <w:rPr>
+          <w:rFonts w:ascii="Times New Roman" w:hAnsi="Times New Roman" w:cs="Times New Roman"/>
+          <w:sz w:val="28"/>
+          <w:szCs w:val="28"/>
+          <w:u w:val="single"/>
+        </w:rPr>
+      </w:pPr>
+      <w:r>
+        <w:rPr>
+          <w:rFonts w:ascii="Times New Roman" w:hAnsi="Times New Roman" w:cs="Times New Roman"/>
+          <w:sz w:val="28"/>
+          <w:szCs w:val="28"/>
+          <w:lang w:val="en-US"/>
+        </w:rPr>
+        <w:t>ID</w:t>
+      </w:r>
+      <w:r>
+        <w:rPr>
+          <w:rFonts w:ascii="Times New Roman" w:hAnsi="Times New Roman" w:cs="Times New Roman"/>
+          <w:sz w:val="28"/>
+          <w:szCs w:val="28"/>
+        </w:rPr>
+        <w:t xml:space="preserve"> </w:t>
+      </w:r>
+      <w:r>
+        <w:rPr>
+          <w:rFonts w:ascii="Times New Roman" w:hAnsi="Times New Roman" w:cs="Times New Roman"/>
+          <w:sz w:val="28"/>
+          <w:szCs w:val="28"/>
+        </w:rPr>
+        <w:t>проекта(число) – уникальный числовой идентификатор проекта, в рамках которого реализуется задача.</w:t>
+      </w:r>
     </w:p>
     <w:sectPr>
       <w:pgSz w:w="11906" w:h="16838"/>
@@ -5126,6 +7163,119 @@
     </w:lvl>
   </w:abstractNum>
   <w:abstractNum w:abstractNumId="7" w15:restartNumberingAfterBreak="0">
+    <w:nsid w:val="36853F2C"/>
+    <w:multiLevelType w:val="hybridMultilevel"/>
+    <w:tmpl w:val="824C4388"/>
+    <w:lvl w:ilvl="0" w:tplc="04190001">
+      <w:start w:val="1"/>
+      <w:numFmt w:val="bullet"/>
+      <w:lvlText w:val=""/>
+      <w:lvlJc w:val="left"/>
+      <w:pPr>
+        <w:ind w:left="720" w:hanging="360"/>
+      </w:pPr>
+      <w:rPr>
+        <w:rFonts w:ascii="Symbol" w:hAnsi="Symbol" w:hint="default"/>
+      </w:rPr>
+    </w:lvl>
+    <w:lvl w:ilvl="1" w:tplc="04190003" w:tentative="1">
+      <w:start w:val="1"/>
+      <w:numFmt w:val="bullet"/>
+      <w:lvlText w:val="o"/>
+      <w:lvlJc w:val="left"/>
+      <w:pPr>
+        <w:ind w:left="1440" w:hanging="360"/>
+      </w:pPr>
+      <w:rPr>
+        <w:rFonts w:ascii="Courier New" w:hAnsi="Courier New" w:cs="Courier New" w:hint="default"/>
+      </w:rPr>
+    </w:lvl>
+    <w:lvl w:ilvl="2" w:tplc="04190005" w:tentative="1">
+      <w:start w:val="1"/>
+      <w:numFmt w:val="bullet"/>
+      <w:lvlText w:val=""/>
+      <w:lvlJc w:val="left"/>
+      <w:pPr>
+        <w:ind w:left="2160" w:hanging="360"/>
+      </w:pPr>
+      <w:rPr>
+        <w:rFonts w:ascii="Wingdings" w:hAnsi="Wingdings" w:hint="default"/>
+      </w:rPr>
+    </w:lvl>
+    <w:lvl w:ilvl="3" w:tplc="04190001" w:tentative="1">
+      <w:start w:val="1"/>
+      <w:numFmt w:val="bullet"/>
+      <w:lvlText w:val=""/>
+      <w:lvlJc w:val="left"/>
+      <w:pPr>
+        <w:ind w:left="2880" w:hanging="360"/>
+      </w:pPr>
+      <w:rPr>
+        <w:rFonts w:ascii="Symbol" w:hAnsi="Symbol" w:hint="default"/>
+      </w:rPr>
+    </w:lvl>
+    <w:lvl w:ilvl="4" w:tplc="04190003" w:tentative="1">
+      <w:start w:val="1"/>
+      <w:numFmt w:val="bullet"/>
+      <w:lvlText w:val="o"/>
+      <w:lvlJc w:val="left"/>
+      <w:pPr>
+        <w:ind w:left="3600" w:hanging="360"/>
+      </w:pPr>
+      <w:rPr>
+        <w:rFonts w:ascii="Courier New" w:hAnsi="Courier New" w:cs="Courier New" w:hint="default"/>
+      </w:rPr>
+    </w:lvl>
+    <w:lvl w:ilvl="5" w:tplc="04190005" w:tentative="1">
+      <w:start w:val="1"/>
+      <w:numFmt w:val="bullet"/>
+      <w:lvlText w:val=""/>
+      <w:lvlJc w:val="left"/>
+      <w:pPr>
+        <w:ind w:left="4320" w:hanging="360"/>
+      </w:pPr>
+      <w:rPr>
+        <w:rFonts w:ascii="Wingdings" w:hAnsi="Wingdings" w:hint="default"/>
+      </w:rPr>
+    </w:lvl>
+    <w:lvl w:ilvl="6" w:tplc="04190001" w:tentative="1">
+      <w:start w:val="1"/>
+      <w:numFmt w:val="bullet"/>
+      <w:lvlText w:val=""/>
+      <w:lvlJc w:val="left"/>
+      <w:pPr>
+        <w:ind w:left="5040" w:hanging="360"/>
+      </w:pPr>
+      <w:rPr>
+        <w:rFonts w:ascii="Symbol" w:hAnsi="Symbol" w:hint="default"/>
+      </w:rPr>
+    </w:lvl>
+    <w:lvl w:ilvl="7" w:tplc="04190003" w:tentative="1">
+      <w:start w:val="1"/>
+      <w:numFmt w:val="bullet"/>
+      <w:lvlText w:val="o"/>
+      <w:lvlJc w:val="left"/>
+      <w:pPr>
+        <w:ind w:left="5760" w:hanging="360"/>
+      </w:pPr>
+      <w:rPr>
+        <w:rFonts w:ascii="Courier New" w:hAnsi="Courier New" w:cs="Courier New" w:hint="default"/>
+      </w:rPr>
+    </w:lvl>
+    <w:lvl w:ilvl="8" w:tplc="04190005" w:tentative="1">
+      <w:start w:val="1"/>
+      <w:numFmt w:val="bullet"/>
+      <w:lvlText w:val=""/>
+      <w:lvlJc w:val="left"/>
+      <w:pPr>
+        <w:ind w:left="6480" w:hanging="360"/>
+      </w:pPr>
+      <w:rPr>
+        <w:rFonts w:ascii="Wingdings" w:hAnsi="Wingdings" w:hint="default"/>
+      </w:rPr>
+    </w:lvl>
+  </w:abstractNum>
+  <w:abstractNum w:abstractNumId="8" w15:restartNumberingAfterBreak="0">
     <w:nsid w:val="3DFD5889"/>
     <w:multiLevelType w:val="hybridMultilevel"/>
     <w:tmpl w:val="035E6A52"/>
@@ -5214,7 +7364,7 @@
       </w:pPr>
     </w:lvl>
   </w:abstractNum>
-  <w:abstractNum w:abstractNumId="8" w15:restartNumberingAfterBreak="0">
+  <w:abstractNum w:abstractNumId="9" w15:restartNumberingAfterBreak="0">
     <w:nsid w:val="45E112A7"/>
     <w:multiLevelType w:val="multilevel"/>
     <w:tmpl w:val="770EDC50"/>
@@ -5336,7 +7486,7 @@
       </w:rPr>
     </w:lvl>
   </w:abstractNum>
-  <w:abstractNum w:abstractNumId="9" w15:restartNumberingAfterBreak="0">
+  <w:abstractNum w:abstractNumId="10" w15:restartNumberingAfterBreak="0">
     <w:nsid w:val="56000A38"/>
     <w:multiLevelType w:val="multilevel"/>
     <w:tmpl w:val="770EDC50"/>
@@ -5458,17 +7608,130 @@
       </w:rPr>
     </w:lvl>
   </w:abstractNum>
+  <w:abstractNum w:abstractNumId="11" w15:restartNumberingAfterBreak="0">
+    <w:nsid w:val="7BE55D71"/>
+    <w:multiLevelType w:val="hybridMultilevel"/>
+    <w:tmpl w:val="E68C132C"/>
+    <w:lvl w:ilvl="0" w:tplc="04190001">
+      <w:start w:val="1"/>
+      <w:numFmt w:val="bullet"/>
+      <w:lvlText w:val=""/>
+      <w:lvlJc w:val="left"/>
+      <w:pPr>
+        <w:ind w:left="720" w:hanging="360"/>
+      </w:pPr>
+      <w:rPr>
+        <w:rFonts w:ascii="Symbol" w:hAnsi="Symbol" w:hint="default"/>
+      </w:rPr>
+    </w:lvl>
+    <w:lvl w:ilvl="1" w:tplc="04190003" w:tentative="1">
+      <w:start w:val="1"/>
+      <w:numFmt w:val="bullet"/>
+      <w:lvlText w:val="o"/>
+      <w:lvlJc w:val="left"/>
+      <w:pPr>
+        <w:ind w:left="1440" w:hanging="360"/>
+      </w:pPr>
+      <w:rPr>
+        <w:rFonts w:ascii="Courier New" w:hAnsi="Courier New" w:cs="Courier New" w:hint="default"/>
+      </w:rPr>
+    </w:lvl>
+    <w:lvl w:ilvl="2" w:tplc="04190005" w:tentative="1">
+      <w:start w:val="1"/>
+      <w:numFmt w:val="bullet"/>
+      <w:lvlText w:val=""/>
+      <w:lvlJc w:val="left"/>
+      <w:pPr>
+        <w:ind w:left="2160" w:hanging="360"/>
+      </w:pPr>
+      <w:rPr>
+        <w:rFonts w:ascii="Wingdings" w:hAnsi="Wingdings" w:hint="default"/>
+      </w:rPr>
+    </w:lvl>
+    <w:lvl w:ilvl="3" w:tplc="04190001" w:tentative="1">
+      <w:start w:val="1"/>
+      <w:numFmt w:val="bullet"/>
+      <w:lvlText w:val=""/>
+      <w:lvlJc w:val="left"/>
+      <w:pPr>
+        <w:ind w:left="2880" w:hanging="360"/>
+      </w:pPr>
+      <w:rPr>
+        <w:rFonts w:ascii="Symbol" w:hAnsi="Symbol" w:hint="default"/>
+      </w:rPr>
+    </w:lvl>
+    <w:lvl w:ilvl="4" w:tplc="04190003" w:tentative="1">
+      <w:start w:val="1"/>
+      <w:numFmt w:val="bullet"/>
+      <w:lvlText w:val="o"/>
+      <w:lvlJc w:val="left"/>
+      <w:pPr>
+        <w:ind w:left="3600" w:hanging="360"/>
+      </w:pPr>
+      <w:rPr>
+        <w:rFonts w:ascii="Courier New" w:hAnsi="Courier New" w:cs="Courier New" w:hint="default"/>
+      </w:rPr>
+    </w:lvl>
+    <w:lvl w:ilvl="5" w:tplc="04190005" w:tentative="1">
+      <w:start w:val="1"/>
+      <w:numFmt w:val="bullet"/>
+      <w:lvlText w:val=""/>
+      <w:lvlJc w:val="left"/>
+      <w:pPr>
+        <w:ind w:left="4320" w:hanging="360"/>
+      </w:pPr>
+      <w:rPr>
+        <w:rFonts w:ascii="Wingdings" w:hAnsi="Wingdings" w:hint="default"/>
+      </w:rPr>
+    </w:lvl>
+    <w:lvl w:ilvl="6" w:tplc="04190001" w:tentative="1">
+      <w:start w:val="1"/>
+      <w:numFmt w:val="bullet"/>
+      <w:lvlText w:val=""/>
+      <w:lvlJc w:val="left"/>
+      <w:pPr>
+        <w:ind w:left="5040" w:hanging="360"/>
+      </w:pPr>
+      <w:rPr>
+        <w:rFonts w:ascii="Symbol" w:hAnsi="Symbol" w:hint="default"/>
+      </w:rPr>
+    </w:lvl>
+    <w:lvl w:ilvl="7" w:tplc="04190003" w:tentative="1">
+      <w:start w:val="1"/>
+      <w:numFmt w:val="bullet"/>
+      <w:lvlText w:val="o"/>
+      <w:lvlJc w:val="left"/>
+      <w:pPr>
+        <w:ind w:left="5760" w:hanging="360"/>
+      </w:pPr>
+      <w:rPr>
+        <w:rFonts w:ascii="Courier New" w:hAnsi="Courier New" w:cs="Courier New" w:hint="default"/>
+      </w:rPr>
+    </w:lvl>
+    <w:lvl w:ilvl="8" w:tplc="04190005" w:tentative="1">
+      <w:start w:val="1"/>
+      <w:numFmt w:val="bullet"/>
+      <w:lvlText w:val=""/>
+      <w:lvlJc w:val="left"/>
+      <w:pPr>
+        <w:ind w:left="6480" w:hanging="360"/>
+      </w:pPr>
+      <w:rPr>
+        <w:rFonts w:ascii="Wingdings" w:hAnsi="Wingdings" w:hint="default"/>
+      </w:rPr>
+    </w:lvl>
+  </w:abstractNum>
   <w:num w:numId="1">
-    <w:abstractNumId w:val="9"/>
+    <w:abstractNumId w:val="10"/>
   </w:num>
   <w:num w:numId="2">
     <w:abstractNumId w:val="2"/>
   </w:num>
   <w:num w:numId="3">
-    <w:abstractNumId w:val="8"/>
+    <w:abstractNumId w:val="9"/>
   </w:num>
   <w:num w:numId="4">
-    <w:abstractNumId w:val="9"/>
+    <w:abstractNumId w:val="10"/>
     <w:lvlOverride w:ilvl="0">
       <w:startOverride w:val="1"/>
     </w:lvlOverride>
@@ -5534,7 +7797,7 @@
     </w:lvlOverride>
   </w:num>
   <w:num w:numId="8">
-    <w:abstractNumId w:val="7"/>
+    <w:abstractNumId w:val="8"/>
   </w:num>
   <w:num w:numId="9">
     <w:abstractNumId w:val="5"/>
@@ -5547,6 +7810,12 @@
   </w:num>
   <w:num w:numId="12">
     <w:abstractNumId w:val="0"/>
+  </w:num>
+  <w:num w:numId="13">
+    <w:abstractNumId w:val="11"/>
+  </w:num>
+  <w:num w:numId="14">
+    <w:abstractNumId w:val="7"/>
   </w:num>
 </w:numbering>
 </file>

</xml_diff>